<commit_message>
colocando prints no pdf
</commit_message>
<xml_diff>
--- a/AP2/Documentacao_Sistema_Orcamentacao_RAG.docx
+++ b/AP2/Documentacao_Sistema_Orcamentacao_RAG.docx
@@ -180,8 +180,16 @@
         <w:rPr>
           <w:lang w:val="pt-BR"/>
         </w:rPr>
-        <w:t>Marcelle Lohane</w:t>
-      </w:r>
+        <w:t xml:space="preserve">Marcelle </w:t>
+      </w:r>
+      <w:proofErr w:type="spellStart"/>
+      <w:r>
+        <w:rPr>
+          <w:lang w:val="pt-BR"/>
+        </w:rPr>
+        <w:t>Lohane</w:t>
+      </w:r>
+      <w:proofErr w:type="spellEnd"/>
       <w:r>
         <w:rPr>
           <w:lang w:val="pt-BR"/>
@@ -284,13 +292,41 @@
         <w:br/>
         <w:t xml:space="preserve">Professor: </w:t>
       </w:r>
+      <w:proofErr w:type="spellStart"/>
       <w:r>
         <w:rPr>
           <w:color w:val="666666"/>
           <w:sz w:val="20"/>
           <w:lang w:val="pt-BR"/>
         </w:rPr>
-        <w:t>Alvaro Riz Barros</w:t>
+        <w:t>Alvaro</w:t>
+      </w:r>
+      <w:proofErr w:type="spellEnd"/>
+      <w:r>
+        <w:rPr>
+          <w:color w:val="666666"/>
+          <w:sz w:val="20"/>
+          <w:lang w:val="pt-BR"/>
+        </w:rPr>
+        <w:t xml:space="preserve"> </w:t>
+      </w:r>
+      <w:proofErr w:type="spellStart"/>
+      <w:r>
+        <w:rPr>
+          <w:color w:val="666666"/>
+          <w:sz w:val="20"/>
+          <w:lang w:val="pt-BR"/>
+        </w:rPr>
+        <w:t>Riz</w:t>
+      </w:r>
+      <w:proofErr w:type="spellEnd"/>
+      <w:r>
+        <w:rPr>
+          <w:color w:val="666666"/>
+          <w:sz w:val="20"/>
+          <w:lang w:val="pt-BR"/>
+        </w:rPr>
+        <w:t xml:space="preserve"> Barros</w:t>
       </w:r>
     </w:p>
     <w:p>
@@ -352,7 +388,21 @@
         <w:rPr>
           <w:lang w:val="pt-BR"/>
         </w:rPr>
-        <w:t>Este documento apresenta a documentação técnica e de engenharia de dados do Sistema Profissional de Orçamentação Corporativa desenvolvido para a avaliação da AP2 na disciplina de Extração e Preparação de Dados. O objetivo central do projeto consiste em estender um protótipo básico de RAG (Retrieval-Augmented Generation) e transformá-lo em uma solução robusta e resiliente de nível de produção, aderente às melhores práticas de mercado.</w:t>
+        <w:t>Este documento apresenta a documentação técnica e de engenharia de dados do Sistema Profissional de Orçamentação Corporativa desenvolvido para a avaliação da AP2 na disciplina de Extração e Preparação de Dados. O objetivo central do projeto consiste em estender um protótipo básico de RAG (</w:t>
+      </w:r>
+      <w:proofErr w:type="spellStart"/>
+      <w:r>
+        <w:rPr>
+          <w:lang w:val="pt-BR"/>
+        </w:rPr>
+        <w:t>Retrieval-Augmented</w:t>
+      </w:r>
+      <w:proofErr w:type="spellEnd"/>
+      <w:r>
+        <w:rPr>
+          <w:lang w:val="pt-BR"/>
+        </w:rPr>
+        <w:t xml:space="preserve"> Generation) e transformá-lo em uma solução robusta e resiliente de nível de produção, aderente às melhores práticas de mercado.</w:t>
       </w:r>
     </w:p>
     <w:p>
@@ -366,7 +416,35 @@
         <w:rPr>
           <w:lang w:val="pt-BR"/>
         </w:rPr>
-        <w:t>A solução é construída sobre a infraestrutura do n8n, operando de forma integrada a um banco de dados vetorial Qdrant e modelos avançados de inteligência artificial via OpenRouter. O pipeline resolve com precisão desafios críticos corporativos, tais como: a interpretação de requisições de clientes em linguagem natural altamente informal, a identificação determinística e probabilística de produtos, a aplicação correta e dinâmica de alíquotas de ICMS estaduais conforme a natureza jurídica do comprador (PF/PJ), e o tratamento rigoroso de exceções através de um isolamento por domínios.</w:t>
+        <w:t xml:space="preserve">A solução é construída sobre a infraestrutura do n8n, operando de forma integrada a um banco de dados vetorial </w:t>
+      </w:r>
+      <w:proofErr w:type="spellStart"/>
+      <w:r>
+        <w:rPr>
+          <w:lang w:val="pt-BR"/>
+        </w:rPr>
+        <w:t>Qdrant</w:t>
+      </w:r>
+      <w:proofErr w:type="spellEnd"/>
+      <w:r>
+        <w:rPr>
+          <w:lang w:val="pt-BR"/>
+        </w:rPr>
+        <w:t xml:space="preserve"> e modelos avançados de inteligência artificial via </w:t>
+      </w:r>
+      <w:proofErr w:type="spellStart"/>
+      <w:r>
+        <w:rPr>
+          <w:lang w:val="pt-BR"/>
+        </w:rPr>
+        <w:t>OpenRouter</w:t>
+      </w:r>
+      <w:proofErr w:type="spellEnd"/>
+      <w:r>
+        <w:rPr>
+          <w:lang w:val="pt-BR"/>
+        </w:rPr>
+        <w:t>. O pipeline resolve com precisão desafios críticos corporativos, tais como: a interpretação de requisições de clientes em linguagem natural altamente informal, a identificação determinística e probabilística de produtos, a aplicação correta e dinâmica de alíquotas de ICMS estaduais conforme a natureza jurídica do comprador (PF/PJ), e o tratamento rigoroso de exceções através de um isolamento por domínios.</w:t>
       </w:r>
     </w:p>
     <w:p>
@@ -414,7 +492,91 @@
         <w:rPr>
           <w:lang w:val="pt-BR"/>
         </w:rPr>
-        <w:t>O fluxo de consulta foi arquitetado sob o modelo orientado a eventos, sendo exposto através de um Webhook corporativo que aceita requisições via método HTTP POST no endpoint /orcamento. A resposta ao cliente é síncrona e estruturada, utilizando o nó Respond to Webhook para garantir a entrega de um JSON padronizado e limpo.</w:t>
+        <w:t xml:space="preserve">O fluxo de consulta foi arquitetado sob o modelo orientado a eventos, sendo exposto através de um </w:t>
+      </w:r>
+      <w:proofErr w:type="spellStart"/>
+      <w:r>
+        <w:rPr>
+          <w:lang w:val="pt-BR"/>
+        </w:rPr>
+        <w:t>Webhook</w:t>
+      </w:r>
+      <w:proofErr w:type="spellEnd"/>
+      <w:r>
+        <w:rPr>
+          <w:lang w:val="pt-BR"/>
+        </w:rPr>
+        <w:t xml:space="preserve"> corporativo que aceita requisições via método HTTP POST no </w:t>
+      </w:r>
+      <w:proofErr w:type="spellStart"/>
+      <w:r>
+        <w:rPr>
+          <w:lang w:val="pt-BR"/>
+        </w:rPr>
+        <w:t>endpoint</w:t>
+      </w:r>
+      <w:proofErr w:type="spellEnd"/>
+      <w:r>
+        <w:rPr>
+          <w:lang w:val="pt-BR"/>
+        </w:rPr>
+        <w:t xml:space="preserve"> /</w:t>
+      </w:r>
+      <w:proofErr w:type="spellStart"/>
+      <w:r>
+        <w:rPr>
+          <w:lang w:val="pt-BR"/>
+        </w:rPr>
+        <w:t>orcamento</w:t>
+      </w:r>
+      <w:proofErr w:type="spellEnd"/>
+      <w:r>
+        <w:rPr>
+          <w:lang w:val="pt-BR"/>
+        </w:rPr>
+        <w:t xml:space="preserve">. A resposta ao cliente é síncrona e estruturada, utilizando o nó </w:t>
+      </w:r>
+      <w:proofErr w:type="spellStart"/>
+      <w:r>
+        <w:rPr>
+          <w:lang w:val="pt-BR"/>
+        </w:rPr>
+        <w:t>Respond</w:t>
+      </w:r>
+      <w:proofErr w:type="spellEnd"/>
+      <w:r>
+        <w:rPr>
+          <w:lang w:val="pt-BR"/>
+        </w:rPr>
+        <w:t xml:space="preserve"> </w:t>
+      </w:r>
+      <w:proofErr w:type="spellStart"/>
+      <w:r>
+        <w:rPr>
+          <w:lang w:val="pt-BR"/>
+        </w:rPr>
+        <w:t>to</w:t>
+      </w:r>
+      <w:proofErr w:type="spellEnd"/>
+      <w:r>
+        <w:rPr>
+          <w:lang w:val="pt-BR"/>
+        </w:rPr>
+        <w:t xml:space="preserve"> </w:t>
+      </w:r>
+      <w:proofErr w:type="spellStart"/>
+      <w:r>
+        <w:rPr>
+          <w:lang w:val="pt-BR"/>
+        </w:rPr>
+        <w:t>Webhook</w:t>
+      </w:r>
+      <w:proofErr w:type="spellEnd"/>
+      <w:r>
+        <w:rPr>
+          <w:lang w:val="pt-BR"/>
+        </w:rPr>
+        <w:t xml:space="preserve"> para garantir a entrega de um JSON padronizado e limpo.</w:t>
       </w:r>
     </w:p>
     <w:p>
@@ -428,7 +590,21 @@
         <w:rPr>
           <w:lang w:val="pt-BR"/>
         </w:rPr>
-        <w:t>O fluxo de dados segue uma esteira linear dividida em cinco macroetapas:</w:t>
+        <w:t xml:space="preserve">O fluxo de dados segue uma esteira linear dividida em cinco </w:t>
+      </w:r>
+      <w:proofErr w:type="spellStart"/>
+      <w:r>
+        <w:rPr>
+          <w:lang w:val="pt-BR"/>
+        </w:rPr>
+        <w:t>macroetapas</w:t>
+      </w:r>
+      <w:proofErr w:type="spellEnd"/>
+      <w:r>
+        <w:rPr>
+          <w:lang w:val="pt-BR"/>
+        </w:rPr>
+        <w:t>:</w:t>
       </w:r>
     </w:p>
     <w:p>
@@ -450,7 +626,63 @@
         <w:rPr>
           <w:lang w:val="pt-BR"/>
         </w:rPr>
-        <w:t xml:space="preserve"> O nó Webhook captura o payload e o sanitiza por meio de um nó de código JavaScript, extraindo e validando o campo obrigatório 'solicitacao'.</w:t>
+        <w:t xml:space="preserve"> O nó </w:t>
+      </w:r>
+      <w:proofErr w:type="spellStart"/>
+      <w:r>
+        <w:rPr>
+          <w:lang w:val="pt-BR"/>
+        </w:rPr>
+        <w:t>Webhook</w:t>
+      </w:r>
+      <w:proofErr w:type="spellEnd"/>
+      <w:r>
+        <w:rPr>
+          <w:lang w:val="pt-BR"/>
+        </w:rPr>
+        <w:t xml:space="preserve"> captura o </w:t>
+      </w:r>
+      <w:proofErr w:type="spellStart"/>
+      <w:r>
+        <w:rPr>
+          <w:lang w:val="pt-BR"/>
+        </w:rPr>
+        <w:t>payload</w:t>
+      </w:r>
+      <w:proofErr w:type="spellEnd"/>
+      <w:r>
+        <w:rPr>
+          <w:lang w:val="pt-BR"/>
+        </w:rPr>
+        <w:t xml:space="preserve"> e o sanitiza por meio de um nó de código </w:t>
+      </w:r>
+      <w:proofErr w:type="spellStart"/>
+      <w:r>
+        <w:rPr>
+          <w:lang w:val="pt-BR"/>
+        </w:rPr>
+        <w:t>JavaScript</w:t>
+      </w:r>
+      <w:proofErr w:type="spellEnd"/>
+      <w:r>
+        <w:rPr>
+          <w:lang w:val="pt-BR"/>
+        </w:rPr>
+        <w:t>, extraindo e validando o campo obrigatório '</w:t>
+      </w:r>
+      <w:proofErr w:type="spellStart"/>
+      <w:r>
+        <w:rPr>
+          <w:lang w:val="pt-BR"/>
+        </w:rPr>
+        <w:t>solicitacao</w:t>
+      </w:r>
+      <w:proofErr w:type="spellEnd"/>
+      <w:r>
+        <w:rPr>
+          <w:lang w:val="pt-BR"/>
+        </w:rPr>
+        <w:t>'.</w:t>
       </w:r>
     </w:p>
     <w:p>
@@ -472,7 +704,21 @@
         <w:rPr>
           <w:lang w:val="pt-BR"/>
         </w:rPr>
-        <w:t xml:space="preserve"> Um agente inteligente alimentado pelo modelo Gemma-4-31b-it via OpenRouter interpreta o texto livre do e-mail do cliente, estruturando um JSON intermediário contendo o estado (UF</w:t>
+        <w:t xml:space="preserve"> Um agente inteligente alimentado pelo modelo Gemma-4-31b-it via </w:t>
+      </w:r>
+      <w:proofErr w:type="spellStart"/>
+      <w:r>
+        <w:rPr>
+          <w:lang w:val="pt-BR"/>
+        </w:rPr>
+        <w:t>OpenRouter</w:t>
+      </w:r>
+      <w:proofErr w:type="spellEnd"/>
+      <w:r>
+        <w:rPr>
+          <w:lang w:val="pt-BR"/>
+        </w:rPr>
+        <w:t xml:space="preserve"> interpreta o texto livre do e-mail do cliente, estruturando um JSON intermediário contendo o estado (UF</w:t>
       </w:r>
       <w:r>
         <w:rPr>
@@ -490,8 +736,16 @@
         <w:rPr>
           <w:lang w:val="pt-BR"/>
         </w:rPr>
-        <w:t>, caso não informado considera pessoa física, pmc</w:t>
-      </w:r>
+        <w:t xml:space="preserve">, caso não informado considera pessoa física, </w:t>
+      </w:r>
+      <w:proofErr w:type="spellStart"/>
+      <w:r>
+        <w:rPr>
+          <w:lang w:val="pt-BR"/>
+        </w:rPr>
+        <w:t>pmc</w:t>
+      </w:r>
+      <w:proofErr w:type="spellEnd"/>
       <w:r>
         <w:rPr>
           <w:lang w:val="pt-BR"/>
@@ -512,13 +766,71 @@
           <w:b/>
           <w:lang w:val="pt-BR"/>
         </w:rPr>
-        <w:t>3. Roteamento Híbrido de Busca (Data Retrieval):</w:t>
-      </w:r>
-      <w:r>
-        <w:rPr>
-          <w:lang w:val="pt-BR"/>
-        </w:rPr>
-        <w:t xml:space="preserve"> Uma estrutura condicional avalia se a lista extraída contém códigos SAP (numéricos puros) ou descrições textuais. Requisições de códigos SAP acionam uma busca exata via API Scroll do Qdrant. Descrições textuais acionam o embedding da HuggingFace e realizam a busca por similaridade de cosseno no banco vetorial.</w:t>
+        <w:t xml:space="preserve">3. Roteamento Híbrido de Busca (Data </w:t>
+      </w:r>
+      <w:proofErr w:type="spellStart"/>
+      <w:r>
+        <w:rPr>
+          <w:b/>
+          <w:lang w:val="pt-BR"/>
+        </w:rPr>
+        <w:t>Retrieval</w:t>
+      </w:r>
+      <w:proofErr w:type="spellEnd"/>
+      <w:r>
+        <w:rPr>
+          <w:b/>
+          <w:lang w:val="pt-BR"/>
+        </w:rPr>
+        <w:t>):</w:t>
+      </w:r>
+      <w:r>
+        <w:rPr>
+          <w:lang w:val="pt-BR"/>
+        </w:rPr>
+        <w:t xml:space="preserve"> Uma estrutura condicional avalia se a lista extraída contém códigos SAP (numéricos puros) ou descrições textuais. Requisições de códigos SAP acionam uma busca exata via API Scroll do </w:t>
+      </w:r>
+      <w:proofErr w:type="spellStart"/>
+      <w:r>
+        <w:rPr>
+          <w:lang w:val="pt-BR"/>
+        </w:rPr>
+        <w:t>Qdrant</w:t>
+      </w:r>
+      <w:proofErr w:type="spellEnd"/>
+      <w:r>
+        <w:rPr>
+          <w:lang w:val="pt-BR"/>
+        </w:rPr>
+        <w:t xml:space="preserve">. Descrições textuais acionam o </w:t>
+      </w:r>
+      <w:proofErr w:type="spellStart"/>
+      <w:r>
+        <w:rPr>
+          <w:lang w:val="pt-BR"/>
+        </w:rPr>
+        <w:t>embedding</w:t>
+      </w:r>
+      <w:proofErr w:type="spellEnd"/>
+      <w:r>
+        <w:rPr>
+          <w:lang w:val="pt-BR"/>
+        </w:rPr>
+        <w:t xml:space="preserve"> da </w:t>
+      </w:r>
+      <w:proofErr w:type="spellStart"/>
+      <w:r>
+        <w:rPr>
+          <w:lang w:val="pt-BR"/>
+        </w:rPr>
+        <w:t>HuggingFace</w:t>
+      </w:r>
+      <w:proofErr w:type="spellEnd"/>
+      <w:r>
+        <w:rPr>
+          <w:lang w:val="pt-BR"/>
+        </w:rPr>
+        <w:t xml:space="preserve"> e realizam a busca por similaridade de cosseno no banco vetorial.</w:t>
       </w:r>
     </w:p>
     <w:p>
@@ -540,7 +852,21 @@
         <w:rPr>
           <w:lang w:val="pt-BR"/>
         </w:rPr>
-        <w:t xml:space="preserve"> Um motor de regras em JavaScript consolida as respostas, remove duplicidades, avalia os scores de confiança (MÁXIMA, ALTA, MÉDIA, BAIXA) e mapeia dinamicamente os preços corretos baseados na UF do cliente e no enquadramento comercial (Preço de Fábrica - PF ou Preço Máximo ao Consumidor - PMC).</w:t>
+        <w:t xml:space="preserve"> Um motor de regras em </w:t>
+      </w:r>
+      <w:proofErr w:type="spellStart"/>
+      <w:r>
+        <w:rPr>
+          <w:lang w:val="pt-BR"/>
+        </w:rPr>
+        <w:t>JavaScript</w:t>
+      </w:r>
+      <w:proofErr w:type="spellEnd"/>
+      <w:r>
+        <w:rPr>
+          <w:lang w:val="pt-BR"/>
+        </w:rPr>
+        <w:t xml:space="preserve"> consolida as respostas, remove duplicidades, avalia os scores de confiança (MÁXIMA, ALTA, MÉDIA, BAIXA) e mapeia dinamicamente os preços corretos baseados na UF do cliente e no enquadramento comercial (Preço de Fábrica - PF ou Preço Máximo ao Consumidor - PMC).</w:t>
       </w:r>
     </w:p>
     <w:p>
@@ -587,117 +913,9 @@
           <w:sz w:val="32"/>
           <w:lang w:val="pt-BR"/>
         </w:rPr>
-        <w:t>3. Estratégia de Ingestão de Dados e Chunking Semântico</w:t>
-      </w:r>
-    </w:p>
-    <w:p>
-      <w:pPr>
-        <w:spacing w:after="120"/>
-        <w:rPr>
-          <w:lang w:val="pt-BR"/>
-        </w:rPr>
-      </w:pPr>
-      <w:r>
-        <w:rPr>
-          <w:color w:val="D3D3D3"/>
-          <w:sz w:val="16"/>
-          <w:lang w:val="pt-BR"/>
-        </w:rPr>
-        <w:t>━━━━━━━━━━━━━━━━━━━━━━━━━━━━━━━━━━━━━━━━━━━━━━━━━━━━━━━</w:t>
-      </w:r>
-    </w:p>
-    <w:p>
-      <w:pPr>
-        <w:spacing w:after="120"/>
-        <w:rPr>
-          <w:lang w:val="pt-BR"/>
-        </w:rPr>
-      </w:pPr>
-      <w:r>
-        <w:rPr>
-          <w:lang w:val="pt-BR"/>
-        </w:rPr>
-        <w:t>Para que o sistema de busca vetorial funcione com precisão milimétrica, o fluxo de ingestão foi desenhado para processar a base de dados oficial (Catalogo-Produtos.csv) convertendo registros tabulares em documentos altamente semânticos.</w:t>
-      </w:r>
-    </w:p>
-    <w:p>
-      <w:pPr>
-        <w:spacing w:after="80"/>
-        <w:rPr>
-          <w:lang w:val="pt-BR"/>
-        </w:rPr>
-      </w:pPr>
-      <w:r>
-        <w:rPr>
-          <w:lang w:val="pt-BR"/>
-        </w:rPr>
-        <w:t>Em vez de utilizar uma divisão por janelas de caracteres ou Token Splitter cru na base inteira (o que fragmentaria as informações cruciais de um medicamento), a solução adota uma estratégia de Chunking Semântico Customizado por Código. O fluxo lê o arquivo CSV e duplica o mapeamento de busca em dois fluxos paralelos que se fundem posteriormente:</w:t>
-      </w:r>
-    </w:p>
-    <w:p>
-      <w:pPr>
-        <w:pStyle w:val="Commarcadores"/>
-        <w:rPr>
-          <w:lang w:val="pt-BR"/>
-        </w:rPr>
-      </w:pPr>
-      <w:r>
-        <w:rPr>
-          <w:b/>
-          <w:lang w:val="pt-BR"/>
-        </w:rPr>
-        <w:t xml:space="preserve">Chunk Semântico por Apresentação/Nome: </w:t>
-      </w:r>
-      <w:r>
-        <w:rPr>
-          <w:lang w:val="pt-BR"/>
-        </w:rPr>
-        <w:t>O conteúdo principal do texto enviado para a geração de embeddings é preenchido unicamente com a string da coluna 'APRESENTAÇÃO'. Isso garante que buscas por nomes comerciais ou apresentações específicas encontrem correspondência exata no espaço vetorial.</w:t>
-      </w:r>
-    </w:p>
-    <w:p>
-      <w:pPr>
-        <w:pStyle w:val="Commarcadores"/>
-        <w:rPr>
-          <w:lang w:val="pt-BR"/>
-        </w:rPr>
-      </w:pPr>
-      <w:r>
-        <w:rPr>
-          <w:b/>
-          <w:lang w:val="pt-BR"/>
-        </w:rPr>
-        <w:t xml:space="preserve">Chunk Semântico por Princípio Ativo: </w:t>
-      </w:r>
-      <w:r>
-        <w:rPr>
-          <w:lang w:val="pt-BR"/>
-        </w:rPr>
-        <w:t>Em paralelo, é gerado um segundo documento onde o conteúdo semântico é preenchido estritamente com o 'PRINCIPIO ATIVO'. Isso permite que e-mails informais que mencionam apenas a substância química (ex: 'acetilcisteína') sejam recuperados com altíssimo score de similaridade, mesmo que o nome comercial seja diferente.</w:t>
-      </w:r>
-    </w:p>
-    <w:p>
-      <w:pPr>
-        <w:spacing w:after="240"/>
-        <w:rPr>
-          <w:lang w:val="pt-BR"/>
-        </w:rPr>
-      </w:pPr>
-      <w:r>
-        <w:rPr>
-          <w:lang w:val="pt-BR"/>
-        </w:rPr>
-        <w:t>Metadados Enriquecidos: Para cada item ingerido, todos os dados estruturados e fiscais são encapsulados no dicionário de metadados do ponto do Qdrant. Isso inclui o código SAP, EAN, Registro MS, Família, Tarja, e o mapa completo de preços indexados por alíquota de ICMS (ICMS 0%, 12%, 17%, 17.5%, 18%, 20%, além de variações regionais como AC/RR, RO, AM/AP). Isso viabiliza que, uma vez localizado o vetor, todas as regras de negócio sejam executadas localmente com latência zero e sem novas chamadas de IA.</w:t>
-      </w:r>
-    </w:p>
-    <w:p>
-      <w:pPr>
-        <w:keepNext/>
-        <w:spacing w:before="280" w:after="120"/>
-        <w:rPr>
-          <w:lang w:val="pt-BR"/>
-        </w:rPr>
-      </w:pPr>
+        <w:t xml:space="preserve">3. Estratégia de Ingestão de Dados e </w:t>
+      </w:r>
+      <w:proofErr w:type="spellStart"/>
       <w:r>
         <w:rPr>
           <w:b/>
@@ -705,7 +923,17 @@
           <w:sz w:val="32"/>
           <w:lang w:val="pt-BR"/>
         </w:rPr>
-        <w:t>4. Configuração do Banco Vetorial e Embeddings</w:t>
+        <w:t>Chunking</w:t>
+      </w:r>
+      <w:proofErr w:type="spellEnd"/>
+      <w:r>
+        <w:rPr>
+          <w:b/>
+          <w:color w:val="1B365D"/>
+          <w:sz w:val="32"/>
+          <w:lang w:val="pt-BR"/>
+        </w:rPr>
+        <w:t xml:space="preserve"> Semântico</w:t>
       </w:r>
     </w:p>
     <w:p>
@@ -727,15 +955,300 @@
     <w:p>
       <w:pPr>
         <w:spacing w:after="120"/>
-      </w:pPr>
-      <w:r>
-        <w:rPr>
-          <w:lang w:val="pt-BR"/>
-        </w:rPr>
-        <w:t xml:space="preserve">O armazenamento e a indexação dos vetores foram implementados utilizando o banco de dados vetorial Qdrant, hospedado em ambiente Cloud de produção. </w:t>
-      </w:r>
-      <w:r>
-        <w:t>As configurações fundamentais adotadas no pipeline de engenharia são:</w:t>
+        <w:rPr>
+          <w:lang w:val="pt-BR"/>
+        </w:rPr>
+      </w:pPr>
+      <w:r>
+        <w:rPr>
+          <w:lang w:val="pt-BR"/>
+        </w:rPr>
+        <w:t>Para que o sistema de busca vetorial funcione com precisão milimétrica, o fluxo de ingestão foi desenhado para processar a base de dados oficial (Catalogo-Produtos.csv) convertendo registros tabulares em documentos altamente semânticos.</w:t>
+      </w:r>
+    </w:p>
+    <w:p>
+      <w:pPr>
+        <w:spacing w:after="80"/>
+        <w:rPr>
+          <w:lang w:val="pt-BR"/>
+        </w:rPr>
+      </w:pPr>
+      <w:r>
+        <w:rPr>
+          <w:lang w:val="pt-BR"/>
+        </w:rPr>
+        <w:t xml:space="preserve">Em vez de utilizar uma divisão por janelas de caracteres ou Token Splitter cru na base inteira (o que fragmentaria as informações cruciais de um medicamento), a solução adota uma estratégia de </w:t>
+      </w:r>
+      <w:proofErr w:type="spellStart"/>
+      <w:r>
+        <w:rPr>
+          <w:lang w:val="pt-BR"/>
+        </w:rPr>
+        <w:t>Chunking</w:t>
+      </w:r>
+      <w:proofErr w:type="spellEnd"/>
+      <w:r>
+        <w:rPr>
+          <w:lang w:val="pt-BR"/>
+        </w:rPr>
+        <w:t xml:space="preserve"> Semântico Customizado por Código. O fluxo lê o arquivo CSV e duplica o mapeamento de busca em dois fluxos paralelos que se fundem posteriormente:</w:t>
+      </w:r>
+    </w:p>
+    <w:p>
+      <w:pPr>
+        <w:pStyle w:val="Commarcadores"/>
+        <w:rPr>
+          <w:lang w:val="pt-BR"/>
+        </w:rPr>
+      </w:pPr>
+      <w:proofErr w:type="spellStart"/>
+      <w:r>
+        <w:rPr>
+          <w:b/>
+          <w:lang w:val="pt-BR"/>
+        </w:rPr>
+        <w:t>Chunk</w:t>
+      </w:r>
+      <w:proofErr w:type="spellEnd"/>
+      <w:r>
+        <w:rPr>
+          <w:b/>
+          <w:lang w:val="pt-BR"/>
+        </w:rPr>
+        <w:t xml:space="preserve"> Semântico por Apresentação/Nome: </w:t>
+      </w:r>
+      <w:r>
+        <w:rPr>
+          <w:lang w:val="pt-BR"/>
+        </w:rPr>
+        <w:t xml:space="preserve">O conteúdo principal do texto enviado para a geração de </w:t>
+      </w:r>
+      <w:proofErr w:type="spellStart"/>
+      <w:r>
+        <w:rPr>
+          <w:lang w:val="pt-BR"/>
+        </w:rPr>
+        <w:t>embeddings</w:t>
+      </w:r>
+      <w:proofErr w:type="spellEnd"/>
+      <w:r>
+        <w:rPr>
+          <w:lang w:val="pt-BR"/>
+        </w:rPr>
+        <w:t xml:space="preserve"> é preenchido unicamente com a </w:t>
+      </w:r>
+      <w:proofErr w:type="spellStart"/>
+      <w:r>
+        <w:rPr>
+          <w:lang w:val="pt-BR"/>
+        </w:rPr>
+        <w:t>string</w:t>
+      </w:r>
+      <w:proofErr w:type="spellEnd"/>
+      <w:r>
+        <w:rPr>
+          <w:lang w:val="pt-BR"/>
+        </w:rPr>
+        <w:t xml:space="preserve"> da coluna 'APRESENTAÇÃO'. Isso garante que buscas por nomes comerciais ou apresentações específicas encontrem correspondência exata no espaço vetorial.</w:t>
+      </w:r>
+    </w:p>
+    <w:p>
+      <w:pPr>
+        <w:pStyle w:val="Commarcadores"/>
+        <w:rPr>
+          <w:lang w:val="pt-BR"/>
+        </w:rPr>
+      </w:pPr>
+      <w:proofErr w:type="spellStart"/>
+      <w:r>
+        <w:rPr>
+          <w:b/>
+          <w:lang w:val="pt-BR"/>
+        </w:rPr>
+        <w:t>Chunk</w:t>
+      </w:r>
+      <w:proofErr w:type="spellEnd"/>
+      <w:r>
+        <w:rPr>
+          <w:b/>
+          <w:lang w:val="pt-BR"/>
+        </w:rPr>
+        <w:t xml:space="preserve"> Semântico por Princípio Ativo: </w:t>
+      </w:r>
+      <w:r>
+        <w:rPr>
+          <w:lang w:val="pt-BR"/>
+        </w:rPr>
+        <w:t>Em paralelo, é gerado um segundo documento onde o conteúdo semântico é preenchido estritamente com o 'PRINCIPIO ATIVO'. Isso permite que e-mails informais que mencionam apenas a substância química (</w:t>
+      </w:r>
+      <w:proofErr w:type="spellStart"/>
+      <w:r>
+        <w:rPr>
+          <w:lang w:val="pt-BR"/>
+        </w:rPr>
+        <w:t>ex</w:t>
+      </w:r>
+      <w:proofErr w:type="spellEnd"/>
+      <w:r>
+        <w:rPr>
+          <w:lang w:val="pt-BR"/>
+        </w:rPr>
+        <w:t>: '</w:t>
+      </w:r>
+      <w:proofErr w:type="spellStart"/>
+      <w:r>
+        <w:rPr>
+          <w:lang w:val="pt-BR"/>
+        </w:rPr>
+        <w:t>acetilcisteína</w:t>
+      </w:r>
+      <w:proofErr w:type="spellEnd"/>
+      <w:r>
+        <w:rPr>
+          <w:lang w:val="pt-BR"/>
+        </w:rPr>
+        <w:t>') sejam recuperados com altíssimo score de similaridade, mesmo que o nome comercial seja diferente.</w:t>
+      </w:r>
+    </w:p>
+    <w:p>
+      <w:pPr>
+        <w:spacing w:after="240"/>
+        <w:rPr>
+          <w:lang w:val="pt-BR"/>
+        </w:rPr>
+      </w:pPr>
+      <w:r>
+        <w:rPr>
+          <w:lang w:val="pt-BR"/>
+        </w:rPr>
+        <w:t xml:space="preserve">Metadados Enriquecidos: Para cada item ingerido, todos os dados estruturados e fiscais são encapsulados no dicionário de metadados do ponto do </w:t>
+      </w:r>
+      <w:proofErr w:type="spellStart"/>
+      <w:r>
+        <w:rPr>
+          <w:lang w:val="pt-BR"/>
+        </w:rPr>
+        <w:t>Qdrant</w:t>
+      </w:r>
+      <w:proofErr w:type="spellEnd"/>
+      <w:r>
+        <w:rPr>
+          <w:lang w:val="pt-BR"/>
+        </w:rPr>
+        <w:t>. Isso inclui o código SAP, EAN, Registro MS, Família, Tarja, e o mapa completo de preços indexados por alíquota de ICMS (ICMS 0%, 12%, 17%, 17.5%, 18%, 20%, além de variações regionais como AC/RR, RO, AM/AP). Isso viabiliza que, uma vez localizado o vetor, todas as regras de negócio sejam executadas localmente com latência zero e sem novas chamadas de IA.</w:t>
+      </w:r>
+    </w:p>
+    <w:p>
+      <w:pPr>
+        <w:keepNext/>
+        <w:spacing w:before="280" w:after="120"/>
+        <w:rPr>
+          <w:lang w:val="pt-BR"/>
+        </w:rPr>
+      </w:pPr>
+      <w:r>
+        <w:rPr>
+          <w:b/>
+          <w:color w:val="1B365D"/>
+          <w:sz w:val="32"/>
+          <w:lang w:val="pt-BR"/>
+        </w:rPr>
+        <w:t xml:space="preserve">4. Configuração do Banco Vetorial e </w:t>
+      </w:r>
+      <w:proofErr w:type="spellStart"/>
+      <w:r>
+        <w:rPr>
+          <w:b/>
+          <w:color w:val="1B365D"/>
+          <w:sz w:val="32"/>
+          <w:lang w:val="pt-BR"/>
+        </w:rPr>
+        <w:t>Embeddings</w:t>
+      </w:r>
+      <w:proofErr w:type="spellEnd"/>
+    </w:p>
+    <w:p>
+      <w:pPr>
+        <w:spacing w:after="120"/>
+        <w:rPr>
+          <w:lang w:val="pt-BR"/>
+        </w:rPr>
+      </w:pPr>
+      <w:r>
+        <w:rPr>
+          <w:color w:val="D3D3D3"/>
+          <w:sz w:val="16"/>
+          <w:lang w:val="pt-BR"/>
+        </w:rPr>
+        <w:t>━━━━━━━━━━━━━━━━━━━━━━━━━━━━━━━━━━━━━━━━━━━━━━━━━━━━━━━</w:t>
+      </w:r>
+    </w:p>
+    <w:p>
+      <w:pPr>
+        <w:spacing w:after="120"/>
+      </w:pPr>
+      <w:r>
+        <w:rPr>
+          <w:lang w:val="pt-BR"/>
+        </w:rPr>
+        <w:t xml:space="preserve">O armazenamento e a indexação dos vetores foram implementados utilizando o banco de dados vetorial </w:t>
+      </w:r>
+      <w:proofErr w:type="spellStart"/>
+      <w:r>
+        <w:rPr>
+          <w:lang w:val="pt-BR"/>
+        </w:rPr>
+        <w:t>Qdrant</w:t>
+      </w:r>
+      <w:proofErr w:type="spellEnd"/>
+      <w:r>
+        <w:rPr>
+          <w:lang w:val="pt-BR"/>
+        </w:rPr>
+        <w:t xml:space="preserve">, hospedado em ambiente Cloud de produção. </w:t>
+      </w:r>
+      <w:r>
+        <w:t xml:space="preserve">As </w:t>
+      </w:r>
+      <w:proofErr w:type="spellStart"/>
+      <w:r>
+        <w:t>configurações</w:t>
+      </w:r>
+      <w:proofErr w:type="spellEnd"/>
+      <w:r>
+        <w:t xml:space="preserve"> </w:t>
+      </w:r>
+      <w:proofErr w:type="spellStart"/>
+      <w:r>
+        <w:t>fundamentais</w:t>
+      </w:r>
+      <w:proofErr w:type="spellEnd"/>
+      <w:r>
+        <w:t xml:space="preserve"> </w:t>
+      </w:r>
+      <w:proofErr w:type="spellStart"/>
+      <w:r>
+        <w:t>adotadas</w:t>
+      </w:r>
+      <w:proofErr w:type="spellEnd"/>
+      <w:r>
+        <w:t xml:space="preserve"> no pipeline de </w:t>
+      </w:r>
+      <w:proofErr w:type="spellStart"/>
+      <w:r>
+        <w:t>engenharia</w:t>
+      </w:r>
+      <w:proofErr w:type="spellEnd"/>
+      <w:r>
+        <w:t xml:space="preserve"> </w:t>
+      </w:r>
+      <w:proofErr w:type="spellStart"/>
+      <w:r>
+        <w:t>são</w:t>
+      </w:r>
+      <w:proofErr w:type="spellEnd"/>
+      <w:r>
+        <w:t>:</w:t>
       </w:r>
     </w:p>
     <w:p>
@@ -784,6 +1297,7 @@
             </w:tcMar>
           </w:tcPr>
           <w:p>
+            <w:proofErr w:type="spellStart"/>
             <w:r>
               <w:rPr>
                 <w:b/>
@@ -791,8 +1305,27 @@
                 <w:sz w:val="21"/>
               </w:rPr>
               <w:lastRenderedPageBreak/>
-              <w:t>Parâmetro de Engenharia</w:t>
+              <w:t>Parâmetro</w:t>
             </w:r>
+            <w:proofErr w:type="spellEnd"/>
+            <w:r>
+              <w:rPr>
+                <w:b/>
+                <w:color w:val="FFFFFF"/>
+                <w:sz w:val="21"/>
+              </w:rPr>
+              <w:t xml:space="preserve"> de </w:t>
+            </w:r>
+            <w:proofErr w:type="spellStart"/>
+            <w:r>
+              <w:rPr>
+                <w:b/>
+                <w:color w:val="FFFFFF"/>
+                <w:sz w:val="21"/>
+              </w:rPr>
+              <w:t>Engenharia</w:t>
+            </w:r>
+            <w:proofErr w:type="spellEnd"/>
           </w:p>
         </w:tc>
         <w:tc>
@@ -807,14 +1340,34 @@
             </w:tcMar>
           </w:tcPr>
           <w:p>
+            <w:proofErr w:type="spellStart"/>
             <w:r>
               <w:rPr>
                 <w:b/>
                 <w:color w:val="FFFFFF"/>
                 <w:sz w:val="21"/>
               </w:rPr>
-              <w:t>Configuração Implementada</w:t>
+              <w:t>Configuração</w:t>
             </w:r>
+            <w:proofErr w:type="spellEnd"/>
+            <w:r>
+              <w:rPr>
+                <w:b/>
+                <w:color w:val="FFFFFF"/>
+                <w:sz w:val="21"/>
+              </w:rPr>
+              <w:t xml:space="preserve"> </w:t>
+            </w:r>
+            <w:proofErr w:type="spellStart"/>
+            <w:r>
+              <w:rPr>
+                <w:b/>
+                <w:color w:val="FFFFFF"/>
+                <w:sz w:val="21"/>
+              </w:rPr>
+              <w:t>Implementada</w:t>
+            </w:r>
+            <w:proofErr w:type="spellEnd"/>
           </w:p>
         </w:tc>
       </w:tr>
@@ -854,11 +1407,19 @@
             </w:tcMar>
           </w:tcPr>
           <w:p>
+            <w:proofErr w:type="spellStart"/>
             <w:r>
               <w:rPr>
                 <w:sz w:val="20"/>
               </w:rPr>
-              <w:t>HuggingFace Inference API - sentence-transformers/all-MiniLM-L6-v2</w:t>
+              <w:t>HuggingFace</w:t>
+            </w:r>
+            <w:proofErr w:type="spellEnd"/>
+            <w:r>
+              <w:rPr>
+                <w:sz w:val="20"/>
+              </w:rPr>
+              <w:t xml:space="preserve"> Inference API - sentence-transformers/all-MiniLM-L6-v2</w:t>
             </w:r>
           </w:p>
         </w:tc>
@@ -878,12 +1439,28 @@
             </w:tcMar>
           </w:tcPr>
           <w:p>
+            <w:proofErr w:type="spellStart"/>
             <w:r>
               <w:rPr>
                 <w:sz w:val="20"/>
               </w:rPr>
-              <w:t>Dimensão Vetorial</w:t>
+              <w:t>Dimensão</w:t>
             </w:r>
+            <w:proofErr w:type="spellEnd"/>
+            <w:r>
+              <w:rPr>
+                <w:sz w:val="20"/>
+              </w:rPr>
+              <w:t xml:space="preserve"> </w:t>
+            </w:r>
+            <w:proofErr w:type="spellStart"/>
+            <w:r>
+              <w:rPr>
+                <w:sz w:val="20"/>
+              </w:rPr>
+              <w:t>Vetorial</w:t>
+            </w:r>
+            <w:proofErr w:type="spellEnd"/>
           </w:p>
         </w:tc>
         <w:tc>
@@ -928,12 +1505,28 @@
             </w:tcMar>
           </w:tcPr>
           <w:p>
+            <w:proofErr w:type="spellStart"/>
             <w:r>
               <w:rPr>
                 <w:sz w:val="20"/>
               </w:rPr>
-              <w:t>Métrica de Distância</w:t>
+              <w:t>Métrica</w:t>
             </w:r>
+            <w:proofErr w:type="spellEnd"/>
+            <w:r>
+              <w:rPr>
+                <w:sz w:val="20"/>
+              </w:rPr>
+              <w:t xml:space="preserve"> de </w:t>
+            </w:r>
+            <w:proofErr w:type="spellStart"/>
+            <w:r>
+              <w:rPr>
+                <w:sz w:val="20"/>
+              </w:rPr>
+              <w:t>Distância</w:t>
+            </w:r>
+            <w:proofErr w:type="spellEnd"/>
           </w:p>
         </w:tc>
         <w:tc>
@@ -958,7 +1551,23 @@
                 <w:sz w:val="20"/>
                 <w:lang w:val="pt-BR"/>
               </w:rPr>
-              <w:t>Similaridade de Cosseno (Cosine Distance), ideal para correspondência textual farmacêutica</w:t>
+              <w:t>Similaridade de Cosseno (</w:t>
+            </w:r>
+            <w:proofErr w:type="spellStart"/>
+            <w:r>
+              <w:rPr>
+                <w:sz w:val="20"/>
+                <w:lang w:val="pt-BR"/>
+              </w:rPr>
+              <w:t>Cosine</w:t>
+            </w:r>
+            <w:proofErr w:type="spellEnd"/>
+            <w:r>
+              <w:rPr>
+                <w:sz w:val="20"/>
+                <w:lang w:val="pt-BR"/>
+              </w:rPr>
+              <w:t xml:space="preserve"> Distance), ideal para correspondência textual farmacêutica</w:t>
             </w:r>
           </w:p>
         </w:tc>
@@ -978,11 +1587,19 @@
             </w:tcMar>
           </w:tcPr>
           <w:p>
+            <w:proofErr w:type="spellStart"/>
             <w:r>
               <w:rPr>
                 <w:sz w:val="20"/>
               </w:rPr>
-              <w:t>Indexação de Chave (SAP)</w:t>
+              <w:t>Indexação</w:t>
+            </w:r>
+            <w:proofErr w:type="spellEnd"/>
+            <w:r>
+              <w:rPr>
+                <w:sz w:val="20"/>
+              </w:rPr>
+              <w:t xml:space="preserve"> de Chave (SAP)</w:t>
             </w:r>
           </w:p>
         </w:tc>
@@ -1007,8 +1624,49 @@
                 <w:sz w:val="20"/>
                 <w:lang w:val="pt-BR"/>
               </w:rPr>
-              <w:t>Criação de um índice do tipo 'keyword' no campo 'metadata.sap' via API do Qdrant</w:t>
+              <w:t>Criação de um índice do tipo '</w:t>
             </w:r>
+            <w:proofErr w:type="spellStart"/>
+            <w:r>
+              <w:rPr>
+                <w:sz w:val="20"/>
+                <w:lang w:val="pt-BR"/>
+              </w:rPr>
+              <w:t>keyword</w:t>
+            </w:r>
+            <w:proofErr w:type="spellEnd"/>
+            <w:r>
+              <w:rPr>
+                <w:sz w:val="20"/>
+                <w:lang w:val="pt-BR"/>
+              </w:rPr>
+              <w:t>' no campo '</w:t>
+            </w:r>
+            <w:proofErr w:type="spellStart"/>
+            <w:r>
+              <w:rPr>
+                <w:sz w:val="20"/>
+                <w:lang w:val="pt-BR"/>
+              </w:rPr>
+              <w:t>metadata.sap</w:t>
+            </w:r>
+            <w:proofErr w:type="spellEnd"/>
+            <w:r>
+              <w:rPr>
+                <w:sz w:val="20"/>
+                <w:lang w:val="pt-BR"/>
+              </w:rPr>
+              <w:t xml:space="preserve">' via API do </w:t>
+            </w:r>
+            <w:proofErr w:type="spellStart"/>
+            <w:r>
+              <w:rPr>
+                <w:sz w:val="20"/>
+                <w:lang w:val="pt-BR"/>
+              </w:rPr>
+              <w:t>Qdrant</w:t>
+            </w:r>
+            <w:proofErr w:type="spellEnd"/>
           </w:p>
         </w:tc>
       </w:tr>
@@ -1066,7 +1724,21 @@
         <w:rPr>
           <w:lang w:val="pt-BR"/>
         </w:rPr>
-        <w:t>O coração cognitivo do pipeline é alimentado pelo modelo google/gemma-4-31b-it, acessado remotamente por meio da API unificada do OpenRouter. A seleção desse arranjo tecnológico baseia-se em critérios técnicos rigorosos de engenharia e regras estabelecidas para o projeto:</w:t>
+        <w:t xml:space="preserve">O coração cognitivo do pipeline é alimentado pelo modelo google/gemma-4-31b-it, acessado remotamente por meio da API unificada do </w:t>
+      </w:r>
+      <w:proofErr w:type="spellStart"/>
+      <w:r>
+        <w:rPr>
+          <w:lang w:val="pt-BR"/>
+        </w:rPr>
+        <w:t>OpenRouter</w:t>
+      </w:r>
+      <w:proofErr w:type="spellEnd"/>
+      <w:r>
+        <w:rPr>
+          <w:lang w:val="pt-BR"/>
+        </w:rPr>
+        <w:t>. A seleção desse arranjo tecnológico baseia-se em critérios técnicos rigorosos de engenharia e regras estabelecidas para o projeto:</w:t>
       </w:r>
     </w:p>
     <w:p>
@@ -1088,7 +1760,49 @@
         <w:rPr>
           <w:lang w:val="pt-BR"/>
         </w:rPr>
-        <w:t>O modelo selecionado está disponível na camada gratuita (free tier) do OpenRouter, cumprindo integralmente o requisito de gratuidade imposto para o desenvolvimento acadêmico, sem abrir mão de alta capacidade computacional.</w:t>
+        <w:t>O modelo selecionado está disponível na camada gratuita (</w:t>
+      </w:r>
+      <w:proofErr w:type="spellStart"/>
+      <w:r>
+        <w:rPr>
+          <w:lang w:val="pt-BR"/>
+        </w:rPr>
+        <w:t>free</w:t>
+      </w:r>
+      <w:proofErr w:type="spellEnd"/>
+      <w:r>
+        <w:rPr>
+          <w:lang w:val="pt-BR"/>
+        </w:rPr>
+        <w:t xml:space="preserve"> </w:t>
+      </w:r>
+      <w:proofErr w:type="spellStart"/>
+      <w:r>
+        <w:rPr>
+          <w:lang w:val="pt-BR"/>
+        </w:rPr>
+        <w:t>tier</w:t>
+      </w:r>
+      <w:proofErr w:type="spellEnd"/>
+      <w:r>
+        <w:rPr>
+          <w:lang w:val="pt-BR"/>
+        </w:rPr>
+        <w:t xml:space="preserve">) do </w:t>
+      </w:r>
+      <w:proofErr w:type="spellStart"/>
+      <w:r>
+        <w:rPr>
+          <w:lang w:val="pt-BR"/>
+        </w:rPr>
+        <w:t>OpenRouter</w:t>
+      </w:r>
+      <w:proofErr w:type="spellEnd"/>
+      <w:r>
+        <w:rPr>
+          <w:lang w:val="pt-BR"/>
+        </w:rPr>
+        <w:t>, cumprindo integralmente o requisito de gratuidade imposto para o desenvolvimento acadêmico, sem abrir mão de alta capacidade computacional.</w:t>
       </w:r>
     </w:p>
     <w:p>
@@ -1110,7 +1824,49 @@
         <w:rPr>
           <w:lang w:val="pt-BR"/>
         </w:rPr>
-        <w:t>O Gemma demonstrou excelente aderência a instruções complexas do sistema (System Messages), garantindo que as saídas dos agentes fossem entregues em formato JSON puro, sem a inclusão de blocos de marcação Markdown (```json) ou explicações textuais que quebrariam o parser automatizado.</w:t>
+        <w:t xml:space="preserve">O Gemma demonstrou excelente aderência a instruções complexas do sistema (System </w:t>
+      </w:r>
+      <w:proofErr w:type="spellStart"/>
+      <w:r>
+        <w:rPr>
+          <w:lang w:val="pt-BR"/>
+        </w:rPr>
+        <w:t>Messages</w:t>
+      </w:r>
+      <w:proofErr w:type="spellEnd"/>
+      <w:r>
+        <w:rPr>
+          <w:lang w:val="pt-BR"/>
+        </w:rPr>
+        <w:t xml:space="preserve">), garantindo que as saídas dos agentes fossem entregues em formato JSON puro, sem a inclusão de blocos de marcação </w:t>
+      </w:r>
+      <w:proofErr w:type="spellStart"/>
+      <w:r>
+        <w:rPr>
+          <w:lang w:val="pt-BR"/>
+        </w:rPr>
+        <w:t>Markdown</w:t>
+      </w:r>
+      <w:proofErr w:type="spellEnd"/>
+      <w:r>
+        <w:rPr>
+          <w:lang w:val="pt-BR"/>
+        </w:rPr>
+        <w:t xml:space="preserve"> (```</w:t>
+      </w:r>
+      <w:proofErr w:type="spellStart"/>
+      <w:r>
+        <w:rPr>
+          <w:lang w:val="pt-BR"/>
+        </w:rPr>
+        <w:t>json</w:t>
+      </w:r>
+      <w:proofErr w:type="spellEnd"/>
+      <w:r>
+        <w:rPr>
+          <w:lang w:val="pt-BR"/>
+        </w:rPr>
+        <w:t>) ou explicações textuais que quebrariam o parser automatizado.</w:t>
       </w:r>
     </w:p>
     <w:p>
@@ -1132,7 +1888,91 @@
         <w:rPr>
           <w:lang w:val="pt-BR"/>
         </w:rPr>
-        <w:t>A arquitetura foi concebida de forma agnóstica em relação à IA generativa. O modelo de texto (Gemma) pode ser facilmente substituído nas configurações dos nós de chat caso haja alteração de cotas. Contudo, a documentação enfatiza que o modelo de Embeddings (HuggingFace L6-v2) deve ser alterado com extrema cautela, uma vez que o tamanho do vetor gerado (384) está estritamente acoplado à dimensão física configurada na coleção do Qdrant. Qualquer alteração no modelo de embeddings exigiria a reconfiguração estrutural do banco e a reingestão integral dos chunks da base de dados.</w:t>
+        <w:t xml:space="preserve">A arquitetura foi concebida de forma agnóstica em relação à IA generativa. O modelo de texto (Gemma) pode ser facilmente substituído nas configurações dos nós de chat caso haja alteração de cotas. Contudo, a documentação enfatiza que o modelo de </w:t>
+      </w:r>
+      <w:proofErr w:type="spellStart"/>
+      <w:r>
+        <w:rPr>
+          <w:lang w:val="pt-BR"/>
+        </w:rPr>
+        <w:t>Embeddings</w:t>
+      </w:r>
+      <w:proofErr w:type="spellEnd"/>
+      <w:r>
+        <w:rPr>
+          <w:lang w:val="pt-BR"/>
+        </w:rPr>
+        <w:t xml:space="preserve"> (</w:t>
+      </w:r>
+      <w:proofErr w:type="spellStart"/>
+      <w:r>
+        <w:rPr>
+          <w:lang w:val="pt-BR"/>
+        </w:rPr>
+        <w:t>HuggingFace</w:t>
+      </w:r>
+      <w:proofErr w:type="spellEnd"/>
+      <w:r>
+        <w:rPr>
+          <w:lang w:val="pt-BR"/>
+        </w:rPr>
+        <w:t xml:space="preserve"> L6-v2) deve ser alterado com extrema cautela, uma vez que o tamanho do vetor gerado (384) está estritamente acoplado à dimensão física configurada na coleção do </w:t>
+      </w:r>
+      <w:proofErr w:type="spellStart"/>
+      <w:r>
+        <w:rPr>
+          <w:lang w:val="pt-BR"/>
+        </w:rPr>
+        <w:t>Qdrant</w:t>
+      </w:r>
+      <w:proofErr w:type="spellEnd"/>
+      <w:r>
+        <w:rPr>
+          <w:lang w:val="pt-BR"/>
+        </w:rPr>
+        <w:t xml:space="preserve">. Qualquer alteração no modelo de </w:t>
+      </w:r>
+      <w:proofErr w:type="spellStart"/>
+      <w:r>
+        <w:rPr>
+          <w:lang w:val="pt-BR"/>
+        </w:rPr>
+        <w:t>embeddings</w:t>
+      </w:r>
+      <w:proofErr w:type="spellEnd"/>
+      <w:r>
+        <w:rPr>
+          <w:lang w:val="pt-BR"/>
+        </w:rPr>
+        <w:t xml:space="preserve"> exigiria a reconfiguração estrutural do banco e a </w:t>
+      </w:r>
+      <w:proofErr w:type="spellStart"/>
+      <w:r>
+        <w:rPr>
+          <w:lang w:val="pt-BR"/>
+        </w:rPr>
+        <w:t>reingestão</w:t>
+      </w:r>
+      <w:proofErr w:type="spellEnd"/>
+      <w:r>
+        <w:rPr>
+          <w:lang w:val="pt-BR"/>
+        </w:rPr>
+        <w:t xml:space="preserve"> integral dos </w:t>
+      </w:r>
+      <w:proofErr w:type="spellStart"/>
+      <w:r>
+        <w:rPr>
+          <w:lang w:val="pt-BR"/>
+        </w:rPr>
+        <w:t>chunks</w:t>
+      </w:r>
+      <w:proofErr w:type="spellEnd"/>
+      <w:r>
+        <w:rPr>
+          <w:lang w:val="pt-BR"/>
+        </w:rPr>
+        <w:t xml:space="preserve"> da base de dados.</w:t>
       </w:r>
     </w:p>
     <w:p>
@@ -1151,161 +1991,9 @@
           <w:lang w:val="pt-BR"/>
         </w:rPr>
         <w:lastRenderedPageBreak/>
-        <w:t>6. Estratégia de Tratamento de Erros e Resiliência (Stop and Error)</w:t>
-      </w:r>
-    </w:p>
-    <w:p>
-      <w:pPr>
-        <w:spacing w:after="120"/>
-        <w:rPr>
-          <w:lang w:val="pt-BR"/>
-        </w:rPr>
-      </w:pPr>
-      <w:r>
-        <w:rPr>
-          <w:color w:val="D3D3D3"/>
-          <w:sz w:val="16"/>
-          <w:lang w:val="pt-BR"/>
-        </w:rPr>
-        <w:t>━━━━━━━━━━━━━━━━━━━━━━━━━━━━━━━━━━━━━━━━━━━━━━━━━━━━━━━</w:t>
-      </w:r>
-    </w:p>
-    <w:p>
-      <w:pPr>
-        <w:spacing w:after="120"/>
-        <w:rPr>
-          <w:lang w:val="pt-BR"/>
-        </w:rPr>
-      </w:pPr>
-      <w:r>
-        <w:rPr>
-          <w:lang w:val="pt-BR"/>
-        </w:rPr>
-        <w:t>Em conformidade com as diretrizes de nível de produção exigidas no edital, o sistema rejeita respostas nulas ou comportamentos inesperados (silent failures). Foi estruturada uma malha fina de captura de exceções baseada na técnica de Stop and Error do n8n, segmentando a aplicação em quatro domínios independentes de auditoria:</w:t>
-      </w:r>
-    </w:p>
-    <w:p>
-      <w:pPr>
-        <w:pStyle w:val="Commarcadores"/>
-        <w:spacing w:after="60"/>
-        <w:rPr>
-          <w:lang w:val="pt-BR"/>
-        </w:rPr>
-      </w:pPr>
-      <w:r>
-        <w:rPr>
-          <w:b/>
-          <w:lang w:val="pt-BR"/>
-        </w:rPr>
-        <w:t xml:space="preserve">• Domínio 1: Validação de Entrada (Erro Entrada): </w:t>
-      </w:r>
-      <w:r>
-        <w:rPr>
-          <w:lang w:val="pt-BR"/>
-        </w:rPr>
-        <w:t xml:space="preserve">Captura payloads malformados, ausência do campo de </w:t>
-      </w:r>
-      <w:r>
-        <w:rPr>
-          <w:lang w:val="pt-BR"/>
-        </w:rPr>
-        <w:t>solicitação</w:t>
-      </w:r>
-      <w:r>
-        <w:rPr>
-          <w:lang w:val="pt-BR"/>
-        </w:rPr>
-        <w:t xml:space="preserve"> ou parâmetros vazios, devolvendo status 500 imediatamente antes de consumir tokens de IA.</w:t>
-      </w:r>
-    </w:p>
-    <w:p>
-      <w:pPr>
-        <w:pStyle w:val="Commarcadores"/>
-        <w:spacing w:after="60"/>
-        <w:rPr>
-          <w:lang w:val="pt-BR"/>
-        </w:rPr>
-      </w:pPr>
-      <w:r>
-        <w:rPr>
-          <w:b/>
-          <w:lang w:val="pt-BR"/>
-        </w:rPr>
-        <w:t xml:space="preserve">• Domínio 2: Extração de Entidades (Erro Extração LLM): </w:t>
-      </w:r>
-      <w:r>
-        <w:rPr>
-          <w:lang w:val="pt-BR"/>
-        </w:rPr>
-        <w:t>Monitora timeouts, estouros de limite de requisições (rate limits) do OpenRouter e, crucialmente, intercepta se a IA retornar um formato estrutural inválido ou uma lista vazia de itens, forçando a rota de erro.</w:t>
-      </w:r>
-    </w:p>
-    <w:p>
-      <w:pPr>
-        <w:pStyle w:val="Commarcadores"/>
-        <w:spacing w:after="60"/>
-        <w:rPr>
-          <w:lang w:val="pt-BR"/>
-        </w:rPr>
-      </w:pPr>
-      <w:r>
-        <w:rPr>
-          <w:b/>
-          <w:lang w:val="pt-BR"/>
-        </w:rPr>
-        <w:t xml:space="preserve">• Domínio 3: Infraestrutura e Recuperação (Erro Busca Vetorial): </w:t>
-      </w:r>
-      <w:r>
-        <w:rPr>
-          <w:lang w:val="pt-BR"/>
-        </w:rPr>
-        <w:t>Captura quedas de conexão com a Cloud do Qdrant ou indisponibilidade pontual na API de inferência de embeddings da HuggingFace.</w:t>
-      </w:r>
-    </w:p>
-    <w:p>
-      <w:pPr>
-        <w:pStyle w:val="Commarcadores"/>
-        <w:spacing w:after="60"/>
-        <w:rPr>
-          <w:lang w:val="pt-BR"/>
-        </w:rPr>
-      </w:pPr>
-      <w:r>
-        <w:rPr>
-          <w:b/>
-          <w:lang w:val="pt-BR"/>
-        </w:rPr>
-        <w:t xml:space="preserve">• Domínio 4: Regras de Negócio e Consolidação (Erro Geração): </w:t>
-      </w:r>
-      <w:r>
-        <w:rPr>
-          <w:lang w:val="pt-BR"/>
-        </w:rPr>
-        <w:t>Valida inconsistências lógico-fiscais no cálculo matemático do orçamento final, problemas no mapeamento de strings ou falhas na conversão monetária.</w:t>
-      </w:r>
-    </w:p>
-    <w:p>
-      <w:pPr>
-        <w:spacing w:after="240"/>
-        <w:rPr>
-          <w:lang w:val="pt-BR"/>
-        </w:rPr>
-      </w:pPr>
-      <w:r>
-        <w:rPr>
-          <w:lang w:val="pt-BR"/>
-        </w:rPr>
-        <w:t>Filosofia de Dupla Camada na Resposta: Cada nó de tratamento de erro executa uma lógica em JavaScript que cria duas saídas distintas e simultâneas. A primeira é uma mensagem amigável e segura enviada de volta ao cliente da API através do Webhook, exibindo um JSON com status 500 e a justificativa no campo 'obs'. A segunda é um objeto de metadados internos rico em detalhes técnicos (contendo o nome do nó exato que falhou, o grupo de domínio e o stacktrace do erro), o qual é injetado no nó Stop and Error. Isso permite que o administrador do sistema audite a falha instantaneamente pelo painel do n8n sem expor dados sensíveis da infraestrutura para o usuário externo.</w:t>
-      </w:r>
-    </w:p>
-    <w:p>
-      <w:pPr>
-        <w:keepNext/>
-        <w:spacing w:before="280" w:after="120"/>
-        <w:rPr>
-          <w:lang w:val="pt-BR"/>
-        </w:rPr>
-      </w:pPr>
+        <w:t xml:space="preserve">6. Estratégia de Tratamento de Erros e Resiliência (Stop </w:t>
+      </w:r>
+      <w:proofErr w:type="spellStart"/>
       <w:r>
         <w:rPr>
           <w:b/>
@@ -1313,184 +2001,9 @@
           <w:sz w:val="32"/>
           <w:lang w:val="pt-BR"/>
         </w:rPr>
-        <w:t>7. Generalização da API e Diferenciais de Engenharia</w:t>
-      </w:r>
-    </w:p>
-    <w:p>
-      <w:pPr>
-        <w:spacing w:after="120"/>
-        <w:rPr>
-          <w:lang w:val="pt-BR"/>
-        </w:rPr>
-      </w:pPr>
-      <w:r>
-        <w:rPr>
-          <w:color w:val="D3D3D3"/>
-          <w:sz w:val="16"/>
-          <w:lang w:val="pt-BR"/>
-        </w:rPr>
-        <w:t>━━━━━━━━━━━━━━━━━━━━━━━━━━━━━━━━━━━━━━━━━━━━━━━━━━━━━━━</w:t>
-      </w:r>
-    </w:p>
-    <w:p>
-      <w:pPr>
-        <w:spacing w:after="120"/>
-        <w:rPr>
-          <w:lang w:val="pt-BR"/>
-        </w:rPr>
-      </w:pPr>
-      <w:r>
-        <w:rPr>
-          <w:lang w:val="pt-BR"/>
-        </w:rPr>
-        <w:t>O sistema cumpre com rigor o critério de generalização. Nenhuma regra de negócio ou mapeamento de string foi hardcoded para a base de dados atual. Caso a banca examinadora realize o upload de um CSV completamente modificado, contendo novos fármacos, dosagens e valores, o pipeline realizará a reindexação automática e continuará operando perfeitamente.</w:t>
-      </w:r>
-      <w:r>
-        <w:rPr>
-          <w:lang w:val="pt-BR"/>
-        </w:rPr>
-        <w:t xml:space="preserve"> O único critério é manter a mesma estrutura de colunas do CSV base</w:t>
-      </w:r>
-      <w:r>
-        <w:rPr>
-          <w:lang w:val="pt-BR"/>
-        </w:rPr>
-        <w:t>.</w:t>
-      </w:r>
-    </w:p>
-    <w:p>
-      <w:pPr>
-        <w:spacing w:after="80"/>
-        <w:rPr>
-          <w:lang w:val="pt-BR"/>
-        </w:rPr>
-      </w:pPr>
-      <w:r>
-        <w:rPr>
-          <w:lang w:val="pt-BR"/>
-        </w:rPr>
-        <w:t>Como diferenciais competitivos de engenharia implementados, destacam-se:</w:t>
-      </w:r>
-    </w:p>
-    <w:p>
-      <w:pPr>
-        <w:pStyle w:val="Commarcadores"/>
-        <w:spacing w:after="60"/>
-        <w:rPr>
-          <w:lang w:val="pt-BR"/>
-        </w:rPr>
-      </w:pPr>
-      <w:r>
-        <w:rPr>
-          <w:b/>
-          <w:lang w:val="pt-BR"/>
-        </w:rPr>
-        <w:t>Busca Híbrid</w:t>
-      </w:r>
-      <w:r>
-        <w:rPr>
-          <w:b/>
-          <w:lang w:val="pt-BR"/>
-        </w:rPr>
-        <w:t>a</w:t>
-      </w:r>
-      <w:r>
-        <w:rPr>
-          <w:b/>
-          <w:lang w:val="pt-BR"/>
-        </w:rPr>
-        <w:t xml:space="preserve">: </w:t>
-      </w:r>
-      <w:r>
-        <w:rPr>
-          <w:lang w:val="pt-BR"/>
-        </w:rPr>
-        <w:t xml:space="preserve">O pipeline não depende exclusivamente de buscas semânticas (que podem apresentar alucinações em códigos numéricos). Ele implementa uma ramificação dupla de busca: códigos SAP são buscados de forma exata e determinística através da API </w:t>
-      </w:r>
-      <w:r>
-        <w:rPr>
-          <w:lang w:val="pt-BR"/>
-        </w:rPr>
-        <w:lastRenderedPageBreak/>
-        <w:t>Scroll indexada do Qdrant, enquanto nomes e princípios ativos entram na esteira de embeddings vetoriais.</w:t>
-      </w:r>
-    </w:p>
-    <w:p>
-      <w:pPr>
-        <w:pStyle w:val="Commarcadores"/>
-        <w:spacing w:after="60"/>
-        <w:rPr>
-          <w:lang w:val="pt-BR"/>
-        </w:rPr>
-      </w:pPr>
-      <w:r>
-        <w:rPr>
-          <w:b/>
-          <w:lang w:val="pt-BR"/>
-        </w:rPr>
-        <w:t xml:space="preserve">Tratamento de Ambiguidade de Produtos (Status 422): </w:t>
-      </w:r>
-      <w:r>
-        <w:rPr>
-          <w:lang w:val="pt-BR"/>
-        </w:rPr>
-        <w:t xml:space="preserve">Se o cliente solicitar um composto de forma genérica (ex: 'ACEBROFILINA') e o banco retornar múltiplas apresentações incompatíveis (como xarope infantil 25mg e xarope adulto 50mg), o sistema não escolhe aleatoriamente. O Agente 2 identifica a colisão, limpa a lista de itens e retorna um status HTTP 422 instruindo o cliente a especificar </w:t>
-      </w:r>
-      <w:r>
-        <w:rPr>
-          <w:lang w:val="pt-BR"/>
-        </w:rPr>
-        <w:t>o produto desejado</w:t>
-      </w:r>
-      <w:r>
-        <w:rPr>
-          <w:lang w:val="pt-BR"/>
-        </w:rPr>
-        <w:t>.</w:t>
-      </w:r>
-    </w:p>
-    <w:p>
-      <w:pPr>
-        <w:pStyle w:val="Commarcadores"/>
-        <w:spacing w:after="60"/>
-        <w:rPr>
-          <w:lang w:val="pt-BR"/>
-        </w:rPr>
-      </w:pPr>
-      <w:r>
-        <w:rPr>
-          <w:b/>
-          <w:lang w:val="pt-BR"/>
-        </w:rPr>
-        <w:t xml:space="preserve">Tratamento de Itens Fora da Base (Status 404): </w:t>
-      </w:r>
-      <w:r>
-        <w:rPr>
-          <w:lang w:val="pt-BR"/>
-        </w:rPr>
-        <w:t>Pedidos de produtos completamente alheios ao escopo da base de dados (ex: 'miojo') passam pela busca vetorial, são filtrados abaixo do threshold de score mínimo (0.40) no nó de tratamento</w:t>
-      </w:r>
-      <w:r>
-        <w:rPr>
-          <w:lang w:val="pt-BR"/>
-        </w:rPr>
-        <w:t>, ou filtrados pelo próprio agente de orçamentação,</w:t>
-      </w:r>
-      <w:r>
-        <w:rPr>
-          <w:lang w:val="pt-BR"/>
-        </w:rPr>
-        <w:t xml:space="preserve"> e disparam uma resposta limpa com status HTTP 404 de produto não localizado.</w:t>
-      </w:r>
-    </w:p>
-    <w:p>
-      <w:pPr>
-        <w:keepNext/>
-        <w:spacing w:before="280" w:after="120"/>
-        <w:rPr>
-          <w:lang w:val="pt-BR"/>
-        </w:rPr>
-      </w:pPr>
+        <w:t>and</w:t>
+      </w:r>
+      <w:proofErr w:type="spellEnd"/>
       <w:r>
         <w:rPr>
           <w:b/>
@@ -1498,7 +2011,7 @@
           <w:sz w:val="32"/>
           <w:lang w:val="pt-BR"/>
         </w:rPr>
-        <w:t>8. Validação do Sistema e Bateria de Testes Automatizados</w:t>
+        <w:t xml:space="preserve"> Error)</w:t>
       </w:r>
     </w:p>
     <w:p>
@@ -1528,7 +2041,690 @@
         <w:rPr>
           <w:lang w:val="pt-BR"/>
         </w:rPr>
-        <w:t>Para a homologação do sistema de orçamentação e comprovação de sua resiliência, a solução foi submetida à bateria oficial de testes integrada à aplicação frontend desenvolvida em Streamlit. A tabela abaixo resume os cenários validados e os comportamentos esperados mapeados de acordo com o caderno de testes da avaliação:</w:t>
+        <w:t>Em conformidade com as diretrizes de nível de produção exigidas no edital, o sistema rejeita respostas nulas ou comportamentos inesperados (</w:t>
+      </w:r>
+      <w:proofErr w:type="spellStart"/>
+      <w:r>
+        <w:rPr>
+          <w:lang w:val="pt-BR"/>
+        </w:rPr>
+        <w:t>silent</w:t>
+      </w:r>
+      <w:proofErr w:type="spellEnd"/>
+      <w:r>
+        <w:rPr>
+          <w:lang w:val="pt-BR"/>
+        </w:rPr>
+        <w:t xml:space="preserve"> </w:t>
+      </w:r>
+      <w:proofErr w:type="spellStart"/>
+      <w:r>
+        <w:rPr>
+          <w:lang w:val="pt-BR"/>
+        </w:rPr>
+        <w:t>failures</w:t>
+      </w:r>
+      <w:proofErr w:type="spellEnd"/>
+      <w:r>
+        <w:rPr>
+          <w:lang w:val="pt-BR"/>
+        </w:rPr>
+        <w:t xml:space="preserve">). Foi estruturada uma malha fina de captura de exceções baseada na técnica de Stop </w:t>
+      </w:r>
+      <w:proofErr w:type="spellStart"/>
+      <w:r>
+        <w:rPr>
+          <w:lang w:val="pt-BR"/>
+        </w:rPr>
+        <w:t>and</w:t>
+      </w:r>
+      <w:proofErr w:type="spellEnd"/>
+      <w:r>
+        <w:rPr>
+          <w:lang w:val="pt-BR"/>
+        </w:rPr>
+        <w:t xml:space="preserve"> Error do n8n, segmentando a aplicação em quatro domínios independentes de auditoria:</w:t>
+      </w:r>
+    </w:p>
+    <w:p>
+      <w:pPr>
+        <w:pStyle w:val="Commarcadores"/>
+        <w:spacing w:after="60"/>
+        <w:rPr>
+          <w:lang w:val="pt-BR"/>
+        </w:rPr>
+      </w:pPr>
+      <w:r>
+        <w:rPr>
+          <w:b/>
+          <w:lang w:val="pt-BR"/>
+        </w:rPr>
+        <w:t xml:space="preserve">• Domínio 1: Validação de Entrada (Erro Entrada): </w:t>
+      </w:r>
+      <w:r>
+        <w:rPr>
+          <w:lang w:val="pt-BR"/>
+        </w:rPr>
+        <w:t xml:space="preserve">Captura </w:t>
+      </w:r>
+      <w:proofErr w:type="spellStart"/>
+      <w:r>
+        <w:rPr>
+          <w:lang w:val="pt-BR"/>
+        </w:rPr>
+        <w:t>payloads</w:t>
+      </w:r>
+      <w:proofErr w:type="spellEnd"/>
+      <w:r>
+        <w:rPr>
+          <w:lang w:val="pt-BR"/>
+        </w:rPr>
+        <w:t xml:space="preserve"> malformados, ausência do campo de </w:t>
+      </w:r>
+      <w:r>
+        <w:rPr>
+          <w:lang w:val="pt-BR"/>
+        </w:rPr>
+        <w:t>solicitação</w:t>
+      </w:r>
+      <w:r>
+        <w:rPr>
+          <w:lang w:val="pt-BR"/>
+        </w:rPr>
+        <w:t xml:space="preserve"> ou parâmetros vazios, devolvendo status 500 imediatamente antes de consumir tokens de IA.</w:t>
+      </w:r>
+    </w:p>
+    <w:p>
+      <w:pPr>
+        <w:pStyle w:val="Commarcadores"/>
+        <w:spacing w:after="60"/>
+        <w:rPr>
+          <w:lang w:val="pt-BR"/>
+        </w:rPr>
+      </w:pPr>
+      <w:r>
+        <w:rPr>
+          <w:b/>
+          <w:lang w:val="pt-BR"/>
+        </w:rPr>
+        <w:t xml:space="preserve">• Domínio 2: Extração de Entidades (Erro Extração LLM): </w:t>
+      </w:r>
+      <w:r>
+        <w:rPr>
+          <w:lang w:val="pt-BR"/>
+        </w:rPr>
+        <w:t xml:space="preserve">Monitora timeouts, estouros de limite de requisições (rate </w:t>
+      </w:r>
+      <w:proofErr w:type="spellStart"/>
+      <w:r>
+        <w:rPr>
+          <w:lang w:val="pt-BR"/>
+        </w:rPr>
+        <w:t>limits</w:t>
+      </w:r>
+      <w:proofErr w:type="spellEnd"/>
+      <w:r>
+        <w:rPr>
+          <w:lang w:val="pt-BR"/>
+        </w:rPr>
+        <w:t xml:space="preserve">) do </w:t>
+      </w:r>
+      <w:proofErr w:type="spellStart"/>
+      <w:r>
+        <w:rPr>
+          <w:lang w:val="pt-BR"/>
+        </w:rPr>
+        <w:t>OpenRouter</w:t>
+      </w:r>
+      <w:proofErr w:type="spellEnd"/>
+      <w:r>
+        <w:rPr>
+          <w:lang w:val="pt-BR"/>
+        </w:rPr>
+        <w:t xml:space="preserve"> e, crucialmente, intercepta se a IA retornar um formato estrutural inválido ou uma lista vazia de itens, forçando a rota de erro.</w:t>
+      </w:r>
+    </w:p>
+    <w:p>
+      <w:pPr>
+        <w:pStyle w:val="Commarcadores"/>
+        <w:spacing w:after="60"/>
+        <w:rPr>
+          <w:lang w:val="pt-BR"/>
+        </w:rPr>
+      </w:pPr>
+      <w:r>
+        <w:rPr>
+          <w:b/>
+          <w:lang w:val="pt-BR"/>
+        </w:rPr>
+        <w:t xml:space="preserve">• Domínio 3: Infraestrutura e Recuperação (Erro Busca Vetorial): </w:t>
+      </w:r>
+      <w:r>
+        <w:rPr>
+          <w:lang w:val="pt-BR"/>
+        </w:rPr>
+        <w:t xml:space="preserve">Captura quedas de conexão com a Cloud do </w:t>
+      </w:r>
+      <w:proofErr w:type="spellStart"/>
+      <w:r>
+        <w:rPr>
+          <w:lang w:val="pt-BR"/>
+        </w:rPr>
+        <w:t>Qdrant</w:t>
+      </w:r>
+      <w:proofErr w:type="spellEnd"/>
+      <w:r>
+        <w:rPr>
+          <w:lang w:val="pt-BR"/>
+        </w:rPr>
+        <w:t xml:space="preserve"> ou indisponibilidade pontual na API de inferência de </w:t>
+      </w:r>
+      <w:proofErr w:type="spellStart"/>
+      <w:r>
+        <w:rPr>
+          <w:lang w:val="pt-BR"/>
+        </w:rPr>
+        <w:t>embeddings</w:t>
+      </w:r>
+      <w:proofErr w:type="spellEnd"/>
+      <w:r>
+        <w:rPr>
+          <w:lang w:val="pt-BR"/>
+        </w:rPr>
+        <w:t xml:space="preserve"> da </w:t>
+      </w:r>
+      <w:proofErr w:type="spellStart"/>
+      <w:r>
+        <w:rPr>
+          <w:lang w:val="pt-BR"/>
+        </w:rPr>
+        <w:t>HuggingFace</w:t>
+      </w:r>
+      <w:proofErr w:type="spellEnd"/>
+      <w:r>
+        <w:rPr>
+          <w:lang w:val="pt-BR"/>
+        </w:rPr>
+        <w:t>.</w:t>
+      </w:r>
+    </w:p>
+    <w:p>
+      <w:pPr>
+        <w:pStyle w:val="Commarcadores"/>
+        <w:spacing w:after="60"/>
+        <w:rPr>
+          <w:lang w:val="pt-BR"/>
+        </w:rPr>
+      </w:pPr>
+      <w:r>
+        <w:rPr>
+          <w:b/>
+          <w:lang w:val="pt-BR"/>
+        </w:rPr>
+        <w:t xml:space="preserve">• Domínio 4: Regras de Negócio e Consolidação (Erro Geração): </w:t>
+      </w:r>
+      <w:r>
+        <w:rPr>
+          <w:lang w:val="pt-BR"/>
+        </w:rPr>
+        <w:t xml:space="preserve">Valida inconsistências lógico-fiscais no cálculo matemático do orçamento final, problemas no mapeamento de </w:t>
+      </w:r>
+      <w:proofErr w:type="spellStart"/>
+      <w:r>
+        <w:rPr>
+          <w:lang w:val="pt-BR"/>
+        </w:rPr>
+        <w:t>strings</w:t>
+      </w:r>
+      <w:proofErr w:type="spellEnd"/>
+      <w:r>
+        <w:rPr>
+          <w:lang w:val="pt-BR"/>
+        </w:rPr>
+        <w:t xml:space="preserve"> ou falhas na conversão monetária.</w:t>
+      </w:r>
+    </w:p>
+    <w:p>
+      <w:pPr>
+        <w:spacing w:after="240"/>
+        <w:rPr>
+          <w:lang w:val="pt-BR"/>
+        </w:rPr>
+      </w:pPr>
+      <w:r>
+        <w:rPr>
+          <w:lang w:val="pt-BR"/>
+        </w:rPr>
+        <w:t xml:space="preserve">Filosofia de Dupla Camada na Resposta: Cada nó de tratamento de erro executa uma lógica em </w:t>
+      </w:r>
+      <w:proofErr w:type="spellStart"/>
+      <w:r>
+        <w:rPr>
+          <w:lang w:val="pt-BR"/>
+        </w:rPr>
+        <w:t>JavaScript</w:t>
+      </w:r>
+      <w:proofErr w:type="spellEnd"/>
+      <w:r>
+        <w:rPr>
+          <w:lang w:val="pt-BR"/>
+        </w:rPr>
+        <w:t xml:space="preserve"> que cria duas saídas distintas e simultâneas. A primeira é uma mensagem amigável e segura enviada de volta ao cliente da API através do </w:t>
+      </w:r>
+      <w:proofErr w:type="spellStart"/>
+      <w:r>
+        <w:rPr>
+          <w:lang w:val="pt-BR"/>
+        </w:rPr>
+        <w:t>Webhook</w:t>
+      </w:r>
+      <w:proofErr w:type="spellEnd"/>
+      <w:r>
+        <w:rPr>
+          <w:lang w:val="pt-BR"/>
+        </w:rPr>
+        <w:t>, exibindo um JSON com status 500 e a justificativa no campo '</w:t>
+      </w:r>
+      <w:proofErr w:type="spellStart"/>
+      <w:r>
+        <w:rPr>
+          <w:lang w:val="pt-BR"/>
+        </w:rPr>
+        <w:t>obs</w:t>
+      </w:r>
+      <w:proofErr w:type="spellEnd"/>
+      <w:r>
+        <w:rPr>
+          <w:lang w:val="pt-BR"/>
+        </w:rPr>
+        <w:t xml:space="preserve">'. A segunda é um objeto de metadados internos rico em detalhes técnicos (contendo o nome do nó exato que falhou, o grupo de domínio e o </w:t>
+      </w:r>
+      <w:proofErr w:type="spellStart"/>
+      <w:r>
+        <w:rPr>
+          <w:lang w:val="pt-BR"/>
+        </w:rPr>
+        <w:t>stacktrace</w:t>
+      </w:r>
+      <w:proofErr w:type="spellEnd"/>
+      <w:r>
+        <w:rPr>
+          <w:lang w:val="pt-BR"/>
+        </w:rPr>
+        <w:t xml:space="preserve"> do erro), o qual é injetado no nó Stop </w:t>
+      </w:r>
+      <w:proofErr w:type="spellStart"/>
+      <w:r>
+        <w:rPr>
+          <w:lang w:val="pt-BR"/>
+        </w:rPr>
+        <w:t>and</w:t>
+      </w:r>
+      <w:proofErr w:type="spellEnd"/>
+      <w:r>
+        <w:rPr>
+          <w:lang w:val="pt-BR"/>
+        </w:rPr>
+        <w:t xml:space="preserve"> Error. Isso permite que o administrador do sistema audite a falha instantaneamente pelo painel do n8n sem expor dados sensíveis da infraestrutura para o usuário externo.</w:t>
+      </w:r>
+    </w:p>
+    <w:p>
+      <w:pPr>
+        <w:keepNext/>
+        <w:spacing w:before="280" w:after="120"/>
+        <w:rPr>
+          <w:lang w:val="pt-BR"/>
+        </w:rPr>
+      </w:pPr>
+      <w:r>
+        <w:rPr>
+          <w:b/>
+          <w:color w:val="1B365D"/>
+          <w:sz w:val="32"/>
+          <w:lang w:val="pt-BR"/>
+        </w:rPr>
+        <w:t>7. Generalização da API e Diferenciais de Engenharia</w:t>
+      </w:r>
+    </w:p>
+    <w:p>
+      <w:pPr>
+        <w:spacing w:after="120"/>
+        <w:rPr>
+          <w:lang w:val="pt-BR"/>
+        </w:rPr>
+      </w:pPr>
+      <w:r>
+        <w:rPr>
+          <w:color w:val="D3D3D3"/>
+          <w:sz w:val="16"/>
+          <w:lang w:val="pt-BR"/>
+        </w:rPr>
+        <w:t>━━━━━━━━━━━━━━━━━━━━━━━━━━━━━━━━━━━━━━━━━━━━━━━━━━━━━━━</w:t>
+      </w:r>
+    </w:p>
+    <w:p>
+      <w:pPr>
+        <w:spacing w:after="120"/>
+        <w:rPr>
+          <w:lang w:val="pt-BR"/>
+        </w:rPr>
+      </w:pPr>
+      <w:r>
+        <w:rPr>
+          <w:lang w:val="pt-BR"/>
+        </w:rPr>
+        <w:t xml:space="preserve">O sistema cumpre com rigor o critério de generalização. Nenhuma regra de negócio ou mapeamento de </w:t>
+      </w:r>
+      <w:proofErr w:type="spellStart"/>
+      <w:r>
+        <w:rPr>
+          <w:lang w:val="pt-BR"/>
+        </w:rPr>
+        <w:t>string</w:t>
+      </w:r>
+      <w:proofErr w:type="spellEnd"/>
+      <w:r>
+        <w:rPr>
+          <w:lang w:val="pt-BR"/>
+        </w:rPr>
+        <w:t xml:space="preserve"> foi </w:t>
+      </w:r>
+      <w:proofErr w:type="spellStart"/>
+      <w:r>
+        <w:rPr>
+          <w:lang w:val="pt-BR"/>
+        </w:rPr>
+        <w:t>hardcoded</w:t>
+      </w:r>
+      <w:proofErr w:type="spellEnd"/>
+      <w:r>
+        <w:rPr>
+          <w:lang w:val="pt-BR"/>
+        </w:rPr>
+        <w:t xml:space="preserve"> para a base de dados atual. Caso a banca examinadora realize o upload de um CSV completamente modificado, contendo novos fármacos, dosagens e valores, o pipeline realizará a reindexação automática e continuará operando perfeitamente.</w:t>
+      </w:r>
+      <w:r>
+        <w:rPr>
+          <w:lang w:val="pt-BR"/>
+        </w:rPr>
+        <w:t xml:space="preserve"> O único critério é manter a mesma estrutura de colunas do CSV base</w:t>
+      </w:r>
+      <w:r>
+        <w:rPr>
+          <w:lang w:val="pt-BR"/>
+        </w:rPr>
+        <w:t>.</w:t>
+      </w:r>
+    </w:p>
+    <w:p>
+      <w:pPr>
+        <w:spacing w:after="80"/>
+        <w:rPr>
+          <w:lang w:val="pt-BR"/>
+        </w:rPr>
+      </w:pPr>
+      <w:r>
+        <w:rPr>
+          <w:lang w:val="pt-BR"/>
+        </w:rPr>
+        <w:t>Como diferenciais competitivos de engenharia implementados, destacam-se:</w:t>
+      </w:r>
+    </w:p>
+    <w:p>
+      <w:pPr>
+        <w:pStyle w:val="Commarcadores"/>
+        <w:spacing w:after="60"/>
+        <w:rPr>
+          <w:lang w:val="pt-BR"/>
+        </w:rPr>
+      </w:pPr>
+      <w:r>
+        <w:rPr>
+          <w:b/>
+          <w:lang w:val="pt-BR"/>
+        </w:rPr>
+        <w:t>Busca Híbrid</w:t>
+      </w:r>
+      <w:r>
+        <w:rPr>
+          <w:b/>
+          <w:lang w:val="pt-BR"/>
+        </w:rPr>
+        <w:t>a</w:t>
+      </w:r>
+      <w:r>
+        <w:rPr>
+          <w:b/>
+          <w:lang w:val="pt-BR"/>
+        </w:rPr>
+        <w:t xml:space="preserve">: </w:t>
+      </w:r>
+      <w:r>
+        <w:rPr>
+          <w:lang w:val="pt-BR"/>
+        </w:rPr>
+        <w:t xml:space="preserve">O pipeline não depende exclusivamente de buscas semânticas (que podem apresentar alucinações em códigos numéricos). Ele implementa uma ramificação dupla de busca: códigos SAP são buscados de forma exata e determinística através da API </w:t>
+      </w:r>
+      <w:r>
+        <w:rPr>
+          <w:lang w:val="pt-BR"/>
+        </w:rPr>
+        <w:lastRenderedPageBreak/>
+        <w:t xml:space="preserve">Scroll indexada do </w:t>
+      </w:r>
+      <w:proofErr w:type="spellStart"/>
+      <w:r>
+        <w:rPr>
+          <w:lang w:val="pt-BR"/>
+        </w:rPr>
+        <w:t>Qdrant</w:t>
+      </w:r>
+      <w:proofErr w:type="spellEnd"/>
+      <w:r>
+        <w:rPr>
+          <w:lang w:val="pt-BR"/>
+        </w:rPr>
+        <w:t xml:space="preserve">, enquanto nomes e princípios ativos entram na esteira de </w:t>
+      </w:r>
+      <w:proofErr w:type="spellStart"/>
+      <w:r>
+        <w:rPr>
+          <w:lang w:val="pt-BR"/>
+        </w:rPr>
+        <w:t>embeddings</w:t>
+      </w:r>
+      <w:proofErr w:type="spellEnd"/>
+      <w:r>
+        <w:rPr>
+          <w:lang w:val="pt-BR"/>
+        </w:rPr>
+        <w:t xml:space="preserve"> vetoriais.</w:t>
+      </w:r>
+    </w:p>
+    <w:p>
+      <w:pPr>
+        <w:pStyle w:val="Commarcadores"/>
+        <w:spacing w:after="60"/>
+        <w:rPr>
+          <w:lang w:val="pt-BR"/>
+        </w:rPr>
+      </w:pPr>
+      <w:r>
+        <w:rPr>
+          <w:b/>
+          <w:lang w:val="pt-BR"/>
+        </w:rPr>
+        <w:t xml:space="preserve">Tratamento de Ambiguidade de Produtos (Status 422): </w:t>
+      </w:r>
+      <w:r>
+        <w:rPr>
+          <w:lang w:val="pt-BR"/>
+        </w:rPr>
+        <w:t>Se o cliente solicitar um composto de forma genérica (</w:t>
+      </w:r>
+      <w:proofErr w:type="spellStart"/>
+      <w:r>
+        <w:rPr>
+          <w:lang w:val="pt-BR"/>
+        </w:rPr>
+        <w:t>ex</w:t>
+      </w:r>
+      <w:proofErr w:type="spellEnd"/>
+      <w:r>
+        <w:rPr>
+          <w:lang w:val="pt-BR"/>
+        </w:rPr>
+        <w:t xml:space="preserve">: 'ACEBROFILINA') e o banco retornar múltiplas apresentações incompatíveis (como xarope infantil 25mg e xarope adulto 50mg), o sistema não escolhe aleatoriamente. O Agente 2 identifica a colisão, limpa a lista de itens e retorna um status HTTP 422 instruindo o cliente a especificar </w:t>
+      </w:r>
+      <w:r>
+        <w:rPr>
+          <w:lang w:val="pt-BR"/>
+        </w:rPr>
+        <w:t>o produto desejado</w:t>
+      </w:r>
+      <w:r>
+        <w:rPr>
+          <w:lang w:val="pt-BR"/>
+        </w:rPr>
+        <w:t>.</w:t>
+      </w:r>
+    </w:p>
+    <w:p>
+      <w:pPr>
+        <w:pStyle w:val="Commarcadores"/>
+        <w:spacing w:after="60"/>
+        <w:rPr>
+          <w:lang w:val="pt-BR"/>
+        </w:rPr>
+      </w:pPr>
+      <w:r>
+        <w:rPr>
+          <w:b/>
+          <w:lang w:val="pt-BR"/>
+        </w:rPr>
+        <w:t xml:space="preserve">Tratamento de Itens Fora da Base (Status 404): </w:t>
+      </w:r>
+      <w:r>
+        <w:rPr>
+          <w:lang w:val="pt-BR"/>
+        </w:rPr>
+        <w:t>Pedidos de produtos completamente alheios ao escopo da base de dados (</w:t>
+      </w:r>
+      <w:proofErr w:type="spellStart"/>
+      <w:r>
+        <w:rPr>
+          <w:lang w:val="pt-BR"/>
+        </w:rPr>
+        <w:t>ex</w:t>
+      </w:r>
+      <w:proofErr w:type="spellEnd"/>
+      <w:r>
+        <w:rPr>
+          <w:lang w:val="pt-BR"/>
+        </w:rPr>
+        <w:t xml:space="preserve">: 'miojo') passam pela busca vetorial, são filtrados abaixo do </w:t>
+      </w:r>
+      <w:proofErr w:type="spellStart"/>
+      <w:r>
+        <w:rPr>
+          <w:lang w:val="pt-BR"/>
+        </w:rPr>
+        <w:t>threshold</w:t>
+      </w:r>
+      <w:proofErr w:type="spellEnd"/>
+      <w:r>
+        <w:rPr>
+          <w:lang w:val="pt-BR"/>
+        </w:rPr>
+        <w:t xml:space="preserve"> de score mínimo (0.40) no nó de tratamento</w:t>
+      </w:r>
+      <w:r>
+        <w:rPr>
+          <w:lang w:val="pt-BR"/>
+        </w:rPr>
+        <w:t>, ou filtrados pelo próprio agente de orçamentação,</w:t>
+      </w:r>
+      <w:r>
+        <w:rPr>
+          <w:lang w:val="pt-BR"/>
+        </w:rPr>
+        <w:t xml:space="preserve"> e disparam uma resposta limpa com status HTTP 404 de produto não localizado.</w:t>
+      </w:r>
+    </w:p>
+    <w:p>
+      <w:pPr>
+        <w:keepNext/>
+        <w:spacing w:before="280" w:after="120"/>
+        <w:rPr>
+          <w:lang w:val="pt-BR"/>
+        </w:rPr>
+      </w:pPr>
+      <w:r>
+        <w:rPr>
+          <w:b/>
+          <w:color w:val="1B365D"/>
+          <w:sz w:val="32"/>
+          <w:lang w:val="pt-BR"/>
+        </w:rPr>
+        <w:t>8. Validação do Sistema e Bateria de Testes Automatizados</w:t>
+      </w:r>
+    </w:p>
+    <w:p>
+      <w:pPr>
+        <w:spacing w:after="120"/>
+        <w:rPr>
+          <w:lang w:val="pt-BR"/>
+        </w:rPr>
+      </w:pPr>
+      <w:r>
+        <w:rPr>
+          <w:color w:val="D3D3D3"/>
+          <w:sz w:val="16"/>
+          <w:lang w:val="pt-BR"/>
+        </w:rPr>
+        <w:t>━━━━━━━━━━━━━━━━━━━━━━━━━━━━━━━━━━━━━━━━━━━━━━━━━━━━━━━</w:t>
+      </w:r>
+    </w:p>
+    <w:p>
+      <w:pPr>
+        <w:spacing w:after="120"/>
+        <w:rPr>
+          <w:lang w:val="pt-BR"/>
+        </w:rPr>
+      </w:pPr>
+      <w:r>
+        <w:rPr>
+          <w:lang w:val="pt-BR"/>
+        </w:rPr>
+        <w:t xml:space="preserve">Para a homologação do sistema de orçamentação e comprovação de sua resiliência, a solução foi submetida à bateria oficial de testes integrada à aplicação </w:t>
+      </w:r>
+      <w:proofErr w:type="spellStart"/>
+      <w:r>
+        <w:rPr>
+          <w:lang w:val="pt-BR"/>
+        </w:rPr>
+        <w:t>frontend</w:t>
+      </w:r>
+      <w:proofErr w:type="spellEnd"/>
+      <w:r>
+        <w:rPr>
+          <w:lang w:val="pt-BR"/>
+        </w:rPr>
+        <w:t xml:space="preserve"> desenvolvida em </w:t>
+      </w:r>
+      <w:proofErr w:type="spellStart"/>
+      <w:r>
+        <w:rPr>
+          <w:lang w:val="pt-BR"/>
+        </w:rPr>
+        <w:t>Streamlit</w:t>
+      </w:r>
+      <w:proofErr w:type="spellEnd"/>
+      <w:r>
+        <w:rPr>
+          <w:lang w:val="pt-BR"/>
+        </w:rPr>
+        <w:t>. A tabela abaixo resume os cenários validados e os comportamentos esperados mapeados de acordo com o caderno de testes da avaliação:</w:t>
       </w:r>
     </w:p>
     <w:tbl>
@@ -1581,13 +2777,23 @@
             </w:tcMar>
           </w:tcPr>
           <w:p>
+            <w:proofErr w:type="spellStart"/>
             <w:r>
               <w:rPr>
                 <w:b/>
                 <w:color w:val="FFFFFF"/>
                 <w:sz w:val="20"/>
               </w:rPr>
-              <w:t>Cenário de Teste</w:t>
+              <w:t>Cenário</w:t>
+            </w:r>
+            <w:proofErr w:type="spellEnd"/>
+            <w:r>
+              <w:rPr>
+                <w:b/>
+                <w:color w:val="FFFFFF"/>
+                <w:sz w:val="20"/>
+              </w:rPr>
+              <w:t xml:space="preserve"> de Teste</w:t>
             </w:r>
           </w:p>
         </w:tc>
@@ -1609,7 +2815,43 @@
                 <w:color w:val="FFFFFF"/>
                 <w:sz w:val="20"/>
               </w:rPr>
-              <w:t>Entrada do Cliente (Solicitação)</w:t>
+              <w:t xml:space="preserve">Entrada do </w:t>
+            </w:r>
+            <w:proofErr w:type="spellStart"/>
+            <w:r>
+              <w:rPr>
+                <w:b/>
+                <w:color w:val="FFFFFF"/>
+                <w:sz w:val="20"/>
+              </w:rPr>
+              <w:t>Cliente</w:t>
+            </w:r>
+            <w:proofErr w:type="spellEnd"/>
+            <w:r>
+              <w:rPr>
+                <w:b/>
+                <w:color w:val="FFFFFF"/>
+                <w:sz w:val="20"/>
+              </w:rPr>
+              <w:t xml:space="preserve"> (</w:t>
+            </w:r>
+            <w:proofErr w:type="spellStart"/>
+            <w:r>
+              <w:rPr>
+                <w:b/>
+                <w:color w:val="FFFFFF"/>
+                <w:sz w:val="20"/>
+              </w:rPr>
+              <w:t>Solicitação</w:t>
+            </w:r>
+            <w:proofErr w:type="spellEnd"/>
+            <w:r>
+              <w:rPr>
+                <w:b/>
+                <w:color w:val="FFFFFF"/>
+                <w:sz w:val="20"/>
+              </w:rPr>
+              <w:t>)</w:t>
             </w:r>
           </w:p>
         </w:tc>
@@ -1631,8 +2873,18 @@
                 <w:color w:val="FFFFFF"/>
                 <w:sz w:val="20"/>
               </w:rPr>
-              <w:t>Status Esperado</w:t>
+              <w:t xml:space="preserve">Status </w:t>
             </w:r>
+            <w:proofErr w:type="spellStart"/>
+            <w:r>
+              <w:rPr>
+                <w:b/>
+                <w:color w:val="FFFFFF"/>
+                <w:sz w:val="20"/>
+              </w:rPr>
+              <w:t>Esperado</w:t>
+            </w:r>
+            <w:proofErr w:type="spellEnd"/>
           </w:p>
         </w:tc>
       </w:tr>
@@ -1679,8 +2931,16 @@
               <w:rPr>
                 <w:sz w:val="19"/>
               </w:rPr>
-              <w:t>Nome Comercial</w:t>
+              <w:t xml:space="preserve">Nome </w:t>
             </w:r>
+            <w:proofErr w:type="spellStart"/>
+            <w:r>
+              <w:rPr>
+                <w:sz w:val="19"/>
+              </w:rPr>
+              <w:t>Comercial</w:t>
+            </w:r>
+            <w:proofErr w:type="spellEnd"/>
           </w:p>
         </w:tc>
         <w:tc>
@@ -1865,12 +3125,42 @@
             </w:tcMar>
           </w:tcPr>
           <w:p>
+            <w:proofErr w:type="spellStart"/>
             <w:r>
               <w:rPr>
                 <w:sz w:val="19"/>
               </w:rPr>
-              <w:t>Princípio Ativo e Dosagem</w:t>
+              <w:t>Princípio</w:t>
             </w:r>
+            <w:proofErr w:type="spellEnd"/>
+            <w:r>
+              <w:rPr>
+                <w:sz w:val="19"/>
+              </w:rPr>
+              <w:t xml:space="preserve"> </w:t>
+            </w:r>
+            <w:proofErr w:type="spellStart"/>
+            <w:r>
+              <w:rPr>
+                <w:sz w:val="19"/>
+              </w:rPr>
+              <w:t>Ativo</w:t>
+            </w:r>
+            <w:proofErr w:type="spellEnd"/>
+            <w:r>
+              <w:rPr>
+                <w:sz w:val="19"/>
+              </w:rPr>
+              <w:t xml:space="preserve"> e </w:t>
+            </w:r>
+            <w:proofErr w:type="spellStart"/>
+            <w:r>
+              <w:rPr>
+                <w:sz w:val="19"/>
+              </w:rPr>
+              <w:t>Dosagem</w:t>
+            </w:r>
+            <w:proofErr w:type="spellEnd"/>
           </w:p>
         </w:tc>
         <w:tc>
@@ -1895,7 +3185,23 @@
                 <w:sz w:val="19"/>
                 <w:lang w:val="pt-BR"/>
               </w:rPr>
-              <w:t>Gostaria de orçamento para 2 unidades de acetilcisteína 40mg xarope.</w:t>
+              <w:t xml:space="preserve">Gostaria de orçamento para 2 unidades de </w:t>
+            </w:r>
+            <w:proofErr w:type="spellStart"/>
+            <w:r>
+              <w:rPr>
+                <w:sz w:val="19"/>
+                <w:lang w:val="pt-BR"/>
+              </w:rPr>
+              <w:t>acetilcisteína</w:t>
+            </w:r>
+            <w:proofErr w:type="spellEnd"/>
+            <w:r>
+              <w:rPr>
+                <w:sz w:val="19"/>
+                <w:lang w:val="pt-BR"/>
+              </w:rPr>
+              <w:t xml:space="preserve"> 40mg xarope.</w:t>
             </w:r>
           </w:p>
         </w:tc>
@@ -1964,8 +3270,16 @@
               <w:rPr>
                 <w:sz w:val="19"/>
               </w:rPr>
-              <w:t>Erro de Digitação</w:t>
+              <w:t xml:space="preserve">Erro de </w:t>
             </w:r>
+            <w:proofErr w:type="spellStart"/>
+            <w:r>
+              <w:rPr>
+                <w:sz w:val="19"/>
+              </w:rPr>
+              <w:t>Digitação</w:t>
+            </w:r>
+            <w:proofErr w:type="spellEnd"/>
           </w:p>
         </w:tc>
         <w:tc>
@@ -1989,7 +3303,23 @@
                 <w:sz w:val="19"/>
                 <w:lang w:val="pt-BR"/>
               </w:rPr>
-              <w:t>Quero 4 unidades de acetilsisteina 20mg.</w:t>
+              <w:t xml:space="preserve">Quero 4 unidades de </w:t>
+            </w:r>
+            <w:proofErr w:type="spellStart"/>
+            <w:r>
+              <w:rPr>
+                <w:sz w:val="19"/>
+                <w:lang w:val="pt-BR"/>
+              </w:rPr>
+              <w:t>acetilsisteina</w:t>
+            </w:r>
+            <w:proofErr w:type="spellEnd"/>
+            <w:r>
+              <w:rPr>
+                <w:sz w:val="19"/>
+                <w:lang w:val="pt-BR"/>
+              </w:rPr>
+              <w:t xml:space="preserve"> 20mg.</w:t>
             </w:r>
           </w:p>
         </w:tc>
@@ -2055,12 +3385,28 @@
             </w:tcMar>
           </w:tcPr>
           <w:p>
+            <w:proofErr w:type="spellStart"/>
             <w:r>
               <w:rPr>
                 <w:sz w:val="19"/>
               </w:rPr>
-              <w:t>Apresentação Específica</w:t>
+              <w:t>Apresentação</w:t>
             </w:r>
+            <w:proofErr w:type="spellEnd"/>
+            <w:r>
+              <w:rPr>
+                <w:sz w:val="19"/>
+              </w:rPr>
+              <w:t xml:space="preserve"> </w:t>
+            </w:r>
+            <w:proofErr w:type="spellStart"/>
+            <w:r>
+              <w:rPr>
+                <w:sz w:val="19"/>
+              </w:rPr>
+              <w:t>Específica</w:t>
+            </w:r>
+            <w:proofErr w:type="spellEnd"/>
           </w:p>
         </w:tc>
         <w:tc>
@@ -2085,7 +3431,23 @@
                 <w:sz w:val="19"/>
                 <w:lang w:val="pt-BR"/>
               </w:rPr>
-              <w:t>Me envie orçamento de 6 unidades de Acheflan creme bisnaga de 30g.</w:t>
+              <w:t xml:space="preserve">Me envie orçamento de 6 unidades de </w:t>
+            </w:r>
+            <w:proofErr w:type="spellStart"/>
+            <w:r>
+              <w:rPr>
+                <w:sz w:val="19"/>
+                <w:lang w:val="pt-BR"/>
+              </w:rPr>
+              <w:t>Acheflan</w:t>
+            </w:r>
+            <w:proofErr w:type="spellEnd"/>
+            <w:r>
+              <w:rPr>
+                <w:sz w:val="19"/>
+                <w:lang w:val="pt-BR"/>
+              </w:rPr>
+              <w:t xml:space="preserve"> creme bisnaga de 30g.</w:t>
             </w:r>
           </w:p>
         </w:tc>
@@ -2150,12 +3512,28 @@
             </w:tcMar>
           </w:tcPr>
           <w:p>
+            <w:proofErr w:type="spellStart"/>
             <w:r>
               <w:rPr>
                 <w:sz w:val="19"/>
               </w:rPr>
-              <w:t>Múltiplos Itens</w:t>
+              <w:t>Múltiplos</w:t>
             </w:r>
+            <w:proofErr w:type="spellEnd"/>
+            <w:r>
+              <w:rPr>
+                <w:sz w:val="19"/>
+              </w:rPr>
+              <w:t xml:space="preserve"> </w:t>
+            </w:r>
+            <w:proofErr w:type="spellStart"/>
+            <w:r>
+              <w:rPr>
+                <w:sz w:val="19"/>
+              </w:rPr>
+              <w:t>Itens</w:t>
+            </w:r>
+            <w:proofErr w:type="spellEnd"/>
           </w:p>
         </w:tc>
         <w:tc>
@@ -2169,11 +3547,33 @@
             </w:tcMar>
           </w:tcPr>
           <w:p>
+            <w:proofErr w:type="spellStart"/>
             <w:r>
               <w:rPr>
                 <w:sz w:val="19"/>
               </w:rPr>
-              <w:t xml:space="preserve">Preciso cotar: 2 un ACICLOVIR 200MG, 3 un creme 50mg, 1 un </w:t>
+              <w:t>Preciso</w:t>
+            </w:r>
+            <w:proofErr w:type="spellEnd"/>
+            <w:r>
+              <w:rPr>
+                <w:sz w:val="19"/>
+              </w:rPr>
+              <w:t xml:space="preserve"> </w:t>
+            </w:r>
+            <w:proofErr w:type="spellStart"/>
+            <w:r>
+              <w:rPr>
+                <w:sz w:val="19"/>
+              </w:rPr>
+              <w:t>cotar</w:t>
+            </w:r>
+            <w:proofErr w:type="spellEnd"/>
+            <w:r>
+              <w:rPr>
+                <w:sz w:val="19"/>
+              </w:rPr>
+              <w:t xml:space="preserve">: 2 un ACICLOVIR 200MG, 3 un creme 50mg, 1 un </w:t>
             </w:r>
             <w:r>
               <w:rPr>
@@ -2251,8 +3651,16 @@
               <w:rPr>
                 <w:sz w:val="19"/>
               </w:rPr>
-              <w:t>Mix Código e Texto</w:t>
+              <w:t xml:space="preserve">Mix Código e </w:t>
             </w:r>
+            <w:proofErr w:type="spellStart"/>
+            <w:r>
+              <w:rPr>
+                <w:sz w:val="19"/>
+              </w:rPr>
+              <w:t>Texto</w:t>
+            </w:r>
+            <w:proofErr w:type="spellEnd"/>
           </w:p>
         </w:tc>
         <w:tc>
@@ -2342,11 +3750,33 @@
             </w:tcMar>
           </w:tcPr>
           <w:p>
+            <w:proofErr w:type="spellStart"/>
             <w:r>
               <w:rPr>
                 <w:sz w:val="19"/>
               </w:rPr>
-              <w:t>Pedido Informal/Linguagem Natural</w:t>
+              <w:t>Pedido</w:t>
+            </w:r>
+            <w:proofErr w:type="spellEnd"/>
+            <w:r>
+              <w:rPr>
+                <w:sz w:val="19"/>
+              </w:rPr>
+              <w:t xml:space="preserve"> Informal/</w:t>
+            </w:r>
+            <w:proofErr w:type="spellStart"/>
+            <w:r>
+              <w:rPr>
+                <w:sz w:val="19"/>
+              </w:rPr>
+              <w:t>Linguagem</w:t>
+            </w:r>
+            <w:proofErr w:type="spellEnd"/>
+            <w:r>
+              <w:rPr>
+                <w:sz w:val="19"/>
+              </w:rPr>
+              <w:t xml:space="preserve"> Natural</w:t>
             </w:r>
           </w:p>
         </w:tc>
@@ -2437,12 +3867,28 @@
             </w:tcMar>
           </w:tcPr>
           <w:p>
+            <w:proofErr w:type="spellStart"/>
             <w:r>
               <w:rPr>
                 <w:sz w:val="19"/>
               </w:rPr>
-              <w:t>Produto Ambíguo</w:t>
+              <w:t>Produto</w:t>
             </w:r>
+            <w:proofErr w:type="spellEnd"/>
+            <w:r>
+              <w:rPr>
+                <w:sz w:val="19"/>
+              </w:rPr>
+              <w:t xml:space="preserve"> </w:t>
+            </w:r>
+            <w:proofErr w:type="spellStart"/>
+            <w:r>
+              <w:rPr>
+                <w:sz w:val="19"/>
+              </w:rPr>
+              <w:t>Ambíguo</w:t>
+            </w:r>
+            <w:proofErr w:type="spellEnd"/>
           </w:p>
         </w:tc>
         <w:tc>
@@ -2490,7 +3936,21 @@
               <w:rPr>
                 <w:sz w:val="19"/>
               </w:rPr>
-              <w:t>422 (Unprocessable)</w:t>
+              <w:t>422 (</w:t>
+            </w:r>
+            <w:proofErr w:type="spellStart"/>
+            <w:r>
+              <w:rPr>
+                <w:sz w:val="19"/>
+              </w:rPr>
+              <w:t>Unprocessable</w:t>
+            </w:r>
+            <w:proofErr w:type="spellEnd"/>
+            <w:r>
+              <w:rPr>
+                <w:sz w:val="19"/>
+              </w:rPr>
+              <w:t>)</w:t>
             </w:r>
           </w:p>
         </w:tc>
@@ -2532,11 +3992,19 @@
             </w:tcMar>
           </w:tcPr>
           <w:p>
+            <w:proofErr w:type="spellStart"/>
             <w:r>
               <w:rPr>
                 <w:sz w:val="19"/>
               </w:rPr>
-              <w:t>Produto Fora da Base</w:t>
+              <w:t>Produto</w:t>
+            </w:r>
+            <w:proofErr w:type="spellEnd"/>
+            <w:r>
+              <w:rPr>
+                <w:sz w:val="19"/>
+              </w:rPr>
+              <w:t xml:space="preserve"> Fora da Base</w:t>
             </w:r>
           </w:p>
         </w:tc>
@@ -2651,7 +4119,35 @@
               <w:rPr>
                 <w:sz w:val="19"/>
               </w:rPr>
-              <w:t>[String Vazia / Campo Ausente]</w:t>
+              <w:t xml:space="preserve">[String </w:t>
+            </w:r>
+            <w:proofErr w:type="spellStart"/>
+            <w:r>
+              <w:rPr>
+                <w:sz w:val="19"/>
+              </w:rPr>
+              <w:t>Vazia</w:t>
+            </w:r>
+            <w:proofErr w:type="spellEnd"/>
+            <w:r>
+              <w:rPr>
+                <w:sz w:val="19"/>
+              </w:rPr>
+              <w:t xml:space="preserve"> / Campo </w:t>
+            </w:r>
+            <w:proofErr w:type="spellStart"/>
+            <w:r>
+              <w:rPr>
+                <w:sz w:val="19"/>
+              </w:rPr>
+              <w:t>Ausente</w:t>
+            </w:r>
+            <w:proofErr w:type="spellEnd"/>
+            <w:r>
+              <w:rPr>
+                <w:sz w:val="19"/>
+              </w:rPr>
+              <w:t>]</w:t>
             </w:r>
           </w:p>
         </w:tc>
@@ -2726,8 +4222,16 @@
               <w:rPr>
                 <w:sz w:val="19"/>
               </w:rPr>
-              <w:t>Sem Produto</w:t>
+              <w:t xml:space="preserve">Sem </w:t>
             </w:r>
+            <w:proofErr w:type="spellStart"/>
+            <w:r>
+              <w:rPr>
+                <w:sz w:val="19"/>
+              </w:rPr>
+              <w:t>Produto</w:t>
+            </w:r>
+            <w:proofErr w:type="spellEnd"/>
           </w:p>
         </w:tc>
         <w:tc>
@@ -2799,7 +4303,27 @@
           <w:sz w:val="26"/>
           <w:lang w:val="pt-BR"/>
         </w:rPr>
-        <w:t>8.1. Evidências de Execução da API (Screenshots)</w:t>
+        <w:t>8.1. Evidências de Execução da API (</w:t>
+      </w:r>
+      <w:proofErr w:type="spellStart"/>
+      <w:r>
+        <w:rPr>
+          <w:b/>
+          <w:color w:val="2E5B88"/>
+          <w:sz w:val="26"/>
+          <w:lang w:val="pt-BR"/>
+        </w:rPr>
+        <w:t>Screenshots</w:t>
+      </w:r>
+      <w:proofErr w:type="spellEnd"/>
+      <w:r>
+        <w:rPr>
+          <w:b/>
+          <w:color w:val="2E5B88"/>
+          <w:sz w:val="26"/>
+          <w:lang w:val="pt-BR"/>
+        </w:rPr>
+        <w:t>)</w:t>
       </w:r>
     </w:p>
     <w:p>
@@ -2813,13 +4337,147 @@
         <w:rPr>
           <w:lang w:val="pt-BR"/>
         </w:rPr>
-        <w:t>[ESPAÇO RESERVADO: Cole aqui os prints de tela capturados da interface do Streamlit comprovando a execução com sucesso e a validação em verde (✅ Passou) de cada um dos 10 casos de teste oficiais da banca examinadora e dos 2 testes de estresse adicionais.]</w:t>
+        <w:drawing>
+          <wp:inline distT="0" distB="0" distL="0" distR="0" wp14:anchorId="279C4946" wp14:editId="7A4DCBDF">
+            <wp:extent cx="5943600" cy="3179445"/>
+            <wp:effectExtent l="0" t="0" r="0" b="1905"/>
+            <wp:docPr id="1536414808" name="Imagem 1"/>
+            <wp:cNvGraphicFramePr>
+              <a:graphicFrameLocks xmlns:a="http://schemas.openxmlformats.org/drawingml/2006/main" noChangeAspect="1"/>
+            </wp:cNvGraphicFramePr>
+            <a:graphic xmlns:a="http://schemas.openxmlformats.org/drawingml/2006/main">
+              <a:graphicData uri="http://schemas.openxmlformats.org/drawingml/2006/picture">
+                <pic:pic xmlns:pic="http://schemas.openxmlformats.org/drawingml/2006/picture">
+                  <pic:nvPicPr>
+                    <pic:cNvPr id="1536414808" name=""/>
+                    <pic:cNvPicPr/>
+                  </pic:nvPicPr>
+                  <pic:blipFill>
+                    <a:blip r:embed="rId6"/>
+                    <a:stretch>
+                      <a:fillRect/>
+                    </a:stretch>
+                  </pic:blipFill>
+                  <pic:spPr>
+                    <a:xfrm>
+                      <a:off x="0" y="0"/>
+                      <a:ext cx="5943600" cy="3179445"/>
+                    </a:xfrm>
+                    <a:prstGeom prst="rect">
+                      <a:avLst/>
+                    </a:prstGeom>
+                  </pic:spPr>
+                </pic:pic>
+              </a:graphicData>
+            </a:graphic>
+          </wp:inline>
+        </w:drawing>
       </w:r>
     </w:p>
     <w:p>
       <w:pPr>
         <w:spacing w:after="240"/>
         <w:rPr>
+          <w:lang w:val="pt-BR"/>
+        </w:rPr>
+      </w:pPr>
+      <w:r>
+        <w:rPr>
+          <w:lang w:val="pt-BR"/>
+        </w:rPr>
+        <w:lastRenderedPageBreak/>
+        <w:drawing>
+          <wp:inline distT="0" distB="0" distL="0" distR="0" wp14:anchorId="625110B6" wp14:editId="05F487AA">
+            <wp:extent cx="5943600" cy="3667760"/>
+            <wp:effectExtent l="0" t="0" r="0" b="8890"/>
+            <wp:docPr id="141794096" name="Imagem 1"/>
+            <wp:cNvGraphicFramePr>
+              <a:graphicFrameLocks xmlns:a="http://schemas.openxmlformats.org/drawingml/2006/main" noChangeAspect="1"/>
+            </wp:cNvGraphicFramePr>
+            <a:graphic xmlns:a="http://schemas.openxmlformats.org/drawingml/2006/main">
+              <a:graphicData uri="http://schemas.openxmlformats.org/drawingml/2006/picture">
+                <pic:pic xmlns:pic="http://schemas.openxmlformats.org/drawingml/2006/picture">
+                  <pic:nvPicPr>
+                    <pic:cNvPr id="141794096" name=""/>
+                    <pic:cNvPicPr/>
+                  </pic:nvPicPr>
+                  <pic:blipFill>
+                    <a:blip r:embed="rId7"/>
+                    <a:stretch>
+                      <a:fillRect/>
+                    </a:stretch>
+                  </pic:blipFill>
+                  <pic:spPr>
+                    <a:xfrm>
+                      <a:off x="0" y="0"/>
+                      <a:ext cx="5943600" cy="3667760"/>
+                    </a:xfrm>
+                    <a:prstGeom prst="rect">
+                      <a:avLst/>
+                    </a:prstGeom>
+                  </pic:spPr>
+                </pic:pic>
+              </a:graphicData>
+            </a:graphic>
+          </wp:inline>
+        </w:drawing>
+      </w:r>
+    </w:p>
+    <w:p>
+      <w:pPr>
+        <w:spacing w:after="240"/>
+        <w:rPr>
+          <w:lang w:val="pt-BR"/>
+        </w:rPr>
+      </w:pPr>
+      <w:r>
+        <w:rPr>
+          <w:lang w:val="pt-BR"/>
+        </w:rPr>
+        <w:drawing>
+          <wp:inline distT="0" distB="0" distL="0" distR="0" wp14:anchorId="30B9E537" wp14:editId="1C8688B0">
+            <wp:extent cx="5943600" cy="3126105"/>
+            <wp:effectExtent l="0" t="0" r="0" b="0"/>
+            <wp:docPr id="1049732664" name="Imagem 1"/>
+            <wp:cNvGraphicFramePr>
+              <a:graphicFrameLocks xmlns:a="http://schemas.openxmlformats.org/drawingml/2006/main" noChangeAspect="1"/>
+            </wp:cNvGraphicFramePr>
+            <a:graphic xmlns:a="http://schemas.openxmlformats.org/drawingml/2006/main">
+              <a:graphicData uri="http://schemas.openxmlformats.org/drawingml/2006/picture">
+                <pic:pic xmlns:pic="http://schemas.openxmlformats.org/drawingml/2006/picture">
+                  <pic:nvPicPr>
+                    <pic:cNvPr id="1049732664" name=""/>
+                    <pic:cNvPicPr/>
+                  </pic:nvPicPr>
+                  <pic:blipFill>
+                    <a:blip r:embed="rId8"/>
+                    <a:stretch>
+                      <a:fillRect/>
+                    </a:stretch>
+                  </pic:blipFill>
+                  <pic:spPr>
+                    <a:xfrm>
+                      <a:off x="0" y="0"/>
+                      <a:ext cx="5943600" cy="3126105"/>
+                    </a:xfrm>
+                    <a:prstGeom prst="rect">
+                      <a:avLst/>
+                    </a:prstGeom>
+                  </pic:spPr>
+                </pic:pic>
+              </a:graphicData>
+            </a:graphic>
+          </wp:inline>
+        </w:drawing>
+      </w:r>
+    </w:p>
+    <w:p>
+      <w:pPr>
+        <w:keepNext/>
+        <w:spacing w:before="280" w:after="120"/>
+        <w:rPr>
+          <w:b/>
+          <w:color w:val="1B365D"/>
           <w:lang w:val="pt-BR"/>
         </w:rPr>
       </w:pPr>
@@ -2903,6 +4561,7 @@
           <w:sz w:val="26"/>
           <w:lang w:val="pt-BR"/>
         </w:rPr>
+        <w:lastRenderedPageBreak/>
         <w:t>9.1. Criação de Contas e Obtenção de Chaves de API</w:t>
       </w:r>
     </w:p>
@@ -2918,19 +4577,43 @@
           <w:lang w:val="pt-BR"/>
         </w:rPr>
       </w:pPr>
+      <w:proofErr w:type="spellStart"/>
       <w:r>
         <w:rPr>
           <w:b/>
           <w:bCs/>
           <w:lang w:val="pt-BR"/>
         </w:rPr>
-        <w:t>Qdrant Cloud (Banco Vetorial):</w:t>
-      </w:r>
-      <w:r>
-        <w:rPr>
-          <w:lang w:val="pt-BR"/>
-        </w:rPr>
-        <w:t xml:space="preserve"> Acesse o painel da Qdrant Cloud, crie uma conta gratuita</w:t>
+        <w:t>Qdrant</w:t>
+      </w:r>
+      <w:proofErr w:type="spellEnd"/>
+      <w:r>
+        <w:rPr>
+          <w:b/>
+          <w:bCs/>
+          <w:lang w:val="pt-BR"/>
+        </w:rPr>
+        <w:t xml:space="preserve"> Cloud (Banco Vetorial):</w:t>
+      </w:r>
+      <w:r>
+        <w:rPr>
+          <w:lang w:val="pt-BR"/>
+        </w:rPr>
+        <w:t xml:space="preserve"> Acesse o painel da </w:t>
+      </w:r>
+      <w:proofErr w:type="spellStart"/>
+      <w:r>
+        <w:rPr>
+          <w:lang w:val="pt-BR"/>
+        </w:rPr>
+        <w:t>Qdrant</w:t>
+      </w:r>
+      <w:proofErr w:type="spellEnd"/>
+      <w:r>
+        <w:rPr>
+          <w:lang w:val="pt-BR"/>
+        </w:rPr>
+        <w:t xml:space="preserve"> Cloud, crie uma conta gratuita</w:t>
       </w:r>
       <w:r>
         <w:rPr>
@@ -2942,7 +4625,49 @@
         <w:rPr>
           <w:lang w:val="pt-BR"/>
         </w:rPr>
-        <w:t>e inicialize um cluster (Free Tier). Copie a URL do endpoint da API (ex:</w:t>
+        <w:t xml:space="preserve">e inicialize um cluster (Free </w:t>
+      </w:r>
+      <w:proofErr w:type="spellStart"/>
+      <w:r>
+        <w:rPr>
+          <w:lang w:val="pt-BR"/>
+        </w:rPr>
+        <w:t>Tier</w:t>
+      </w:r>
+      <w:proofErr w:type="spellEnd"/>
+      <w:r>
+        <w:rPr>
+          <w:lang w:val="pt-BR"/>
+        </w:rPr>
+        <w:t xml:space="preserve">). Copie a URL do </w:t>
+      </w:r>
+      <w:proofErr w:type="spellStart"/>
+      <w:r>
+        <w:rPr>
+          <w:lang w:val="pt-BR"/>
+        </w:rPr>
+        <w:t>endpoint</w:t>
+      </w:r>
+      <w:proofErr w:type="spellEnd"/>
+      <w:r>
+        <w:rPr>
+          <w:lang w:val="pt-BR"/>
+        </w:rPr>
+        <w:t xml:space="preserve"> da API (</w:t>
+      </w:r>
+      <w:proofErr w:type="spellStart"/>
+      <w:r>
+        <w:rPr>
+          <w:lang w:val="pt-BR"/>
+        </w:rPr>
+        <w:t>ex</w:t>
+      </w:r>
+      <w:proofErr w:type="spellEnd"/>
+      <w:r>
+        <w:rPr>
+          <w:lang w:val="pt-BR"/>
+        </w:rPr>
+        <w:t>:</w:t>
       </w:r>
       <w:r>
         <w:rPr>
@@ -2969,19 +4694,43 @@
           <w:lang w:val="pt-BR"/>
         </w:rPr>
       </w:pPr>
+      <w:proofErr w:type="spellStart"/>
       <w:r>
         <w:rPr>
           <w:b/>
           <w:bCs/>
           <w:lang w:val="pt-BR"/>
         </w:rPr>
-        <w:t>OpenRouter (Modelos LLM):</w:t>
-      </w:r>
-      <w:r>
-        <w:rPr>
-          <w:lang w:val="pt-BR"/>
-        </w:rPr>
-        <w:t xml:space="preserve"> Crie uma conta no OpenRouter. Acesse a área de chaves de</w:t>
+        <w:t>OpenRouter</w:t>
+      </w:r>
+      <w:proofErr w:type="spellEnd"/>
+      <w:r>
+        <w:rPr>
+          <w:b/>
+          <w:bCs/>
+          <w:lang w:val="pt-BR"/>
+        </w:rPr>
+        <w:t xml:space="preserve"> (Modelos LLM):</w:t>
+      </w:r>
+      <w:r>
+        <w:rPr>
+          <w:lang w:val="pt-BR"/>
+        </w:rPr>
+        <w:t xml:space="preserve"> Crie uma conta no </w:t>
+      </w:r>
+      <w:proofErr w:type="spellStart"/>
+      <w:r>
+        <w:rPr>
+          <w:lang w:val="pt-BR"/>
+        </w:rPr>
+        <w:t>OpenRouter</w:t>
+      </w:r>
+      <w:proofErr w:type="spellEnd"/>
+      <w:r>
+        <w:rPr>
+          <w:lang w:val="pt-BR"/>
+        </w:rPr>
+        <w:t>. Acesse a área de chaves de</w:t>
       </w:r>
       <w:r>
         <w:rPr>
@@ -3020,20 +4769,61 @@
           <w:lang w:val="pt-BR"/>
         </w:rPr>
       </w:pPr>
+      <w:proofErr w:type="spellStart"/>
       <w:r>
         <w:rPr>
           <w:b/>
           <w:bCs/>
           <w:lang w:val="pt-BR"/>
         </w:rPr>
-        <w:lastRenderedPageBreak/>
-        <w:t>Hugging Face (Embeddings):</w:t>
-      </w:r>
-      <w:r>
-        <w:rPr>
-          <w:lang w:val="pt-BR"/>
-        </w:rPr>
-        <w:t xml:space="preserve"> Crie uma conta no Hugging Face, navegue até as</w:t>
+        <w:t>Hugging</w:t>
+      </w:r>
+      <w:proofErr w:type="spellEnd"/>
+      <w:r>
+        <w:rPr>
+          <w:b/>
+          <w:bCs/>
+          <w:lang w:val="pt-BR"/>
+        </w:rPr>
+        <w:t xml:space="preserve"> Face (</w:t>
+      </w:r>
+      <w:proofErr w:type="spellStart"/>
+      <w:r>
+        <w:rPr>
+          <w:b/>
+          <w:bCs/>
+          <w:lang w:val="pt-BR"/>
+        </w:rPr>
+        <w:t>Embeddings</w:t>
+      </w:r>
+      <w:proofErr w:type="spellEnd"/>
+      <w:r>
+        <w:rPr>
+          <w:b/>
+          <w:bCs/>
+          <w:lang w:val="pt-BR"/>
+        </w:rPr>
+        <w:t>):</w:t>
+      </w:r>
+      <w:r>
+        <w:rPr>
+          <w:lang w:val="pt-BR"/>
+        </w:rPr>
+        <w:t xml:space="preserve"> Crie uma conta no </w:t>
+      </w:r>
+      <w:proofErr w:type="spellStart"/>
+      <w:r>
+        <w:rPr>
+          <w:lang w:val="pt-BR"/>
+        </w:rPr>
+        <w:t>Hugging</w:t>
+      </w:r>
+      <w:proofErr w:type="spellEnd"/>
+      <w:r>
+        <w:rPr>
+          <w:lang w:val="pt-BR"/>
+        </w:rPr>
+        <w:t xml:space="preserve"> Face, navegue até as</w:t>
       </w:r>
       <w:r>
         <w:rPr>
@@ -3087,7 +4877,35 @@
         <w:rPr>
           <w:lang w:val="pt-BR"/>
         </w:rPr>
-        <w:t>de leitura (Read) para autenticar as chamadas da Inference API.</w:t>
+        <w:t>de leitura (</w:t>
+      </w:r>
+      <w:proofErr w:type="spellStart"/>
+      <w:r>
+        <w:rPr>
+          <w:lang w:val="pt-BR"/>
+        </w:rPr>
+        <w:t>Read</w:t>
+      </w:r>
+      <w:proofErr w:type="spellEnd"/>
+      <w:r>
+        <w:rPr>
+          <w:lang w:val="pt-BR"/>
+        </w:rPr>
+        <w:t xml:space="preserve">) para autenticar as chamadas da </w:t>
+      </w:r>
+      <w:proofErr w:type="spellStart"/>
+      <w:r>
+        <w:rPr>
+          <w:lang w:val="pt-BR"/>
+        </w:rPr>
+        <w:t>Inference</w:t>
+      </w:r>
+      <w:proofErr w:type="spellEnd"/>
+      <w:r>
+        <w:rPr>
+          <w:lang w:val="pt-BR"/>
+        </w:rPr>
+        <w:t xml:space="preserve"> API.</w:t>
       </w:r>
     </w:p>
     <w:p>
@@ -3122,7 +4940,21 @@
         <w:rPr>
           <w:lang w:val="pt-BR"/>
         </w:rPr>
-        <w:t>Com a sua instância do n8n ativa, realize o deploy dos fluxos utilizando os arquivos JSON</w:t>
+        <w:t xml:space="preserve">Com a sua instância do n8n ativa, realize o </w:t>
+      </w:r>
+      <w:proofErr w:type="spellStart"/>
+      <w:r>
+        <w:rPr>
+          <w:lang w:val="pt-BR"/>
+        </w:rPr>
+        <w:t>deploy</w:t>
+      </w:r>
+      <w:proofErr w:type="spellEnd"/>
+      <w:r>
+        <w:rPr>
+          <w:lang w:val="pt-BR"/>
+        </w:rPr>
+        <w:t xml:space="preserve"> dos fluxos utilizando os arquivos JSON</w:t>
       </w:r>
       <w:r>
         <w:rPr>
@@ -3181,11 +5013,33 @@
         </w:rPr>
         <w:t>‘</w:t>
       </w:r>
-      <w:r>
-        <w:rPr>
-          <w:lang w:val="pt-BR"/>
-        </w:rPr>
-        <w:t>Import from file</w:t>
+      <w:proofErr w:type="spellStart"/>
+      <w:r>
+        <w:rPr>
+          <w:lang w:val="pt-BR"/>
+        </w:rPr>
+        <w:t>Import</w:t>
+      </w:r>
+      <w:proofErr w:type="spellEnd"/>
+      <w:r>
+        <w:rPr>
+          <w:lang w:val="pt-BR"/>
+        </w:rPr>
+        <w:t xml:space="preserve"> </w:t>
+      </w:r>
+      <w:proofErr w:type="spellStart"/>
+      <w:r>
+        <w:rPr>
+          <w:lang w:val="pt-BR"/>
+        </w:rPr>
+        <w:t>from</w:t>
+      </w:r>
+      <w:proofErr w:type="spellEnd"/>
+      <w:r>
+        <w:rPr>
+          <w:lang w:val="pt-BR"/>
+        </w:rPr>
+        <w:t xml:space="preserve"> file</w:t>
       </w:r>
       <w:r>
         <w:rPr>
@@ -3209,8 +5063,16 @@
         <w:rPr>
           <w:lang w:val="pt-BR"/>
         </w:rPr>
-        <w:t>AP2 - Chunking.json</w:t>
-      </w:r>
+        <w:t xml:space="preserve">AP2 - </w:t>
+      </w:r>
+      <w:proofErr w:type="spellStart"/>
+      <w:r>
+        <w:rPr>
+          <w:lang w:val="pt-BR"/>
+        </w:rPr>
+        <w:t>Chunking.json</w:t>
+      </w:r>
+      <w:proofErr w:type="spellEnd"/>
       <w:r>
         <w:rPr>
           <w:lang w:val="pt-BR"/>
@@ -3266,8 +5128,16 @@
         <w:rPr>
           <w:lang w:val="pt-BR"/>
         </w:rPr>
-        <w:t>AP2 - Consulta.json</w:t>
-      </w:r>
+        <w:t xml:space="preserve">AP2 - </w:t>
+      </w:r>
+      <w:proofErr w:type="spellStart"/>
+      <w:r>
+        <w:rPr>
+          <w:lang w:val="pt-BR"/>
+        </w:rPr>
+        <w:t>Consulta.json</w:t>
+      </w:r>
+      <w:proofErr w:type="spellEnd"/>
       <w:r>
         <w:rPr>
           <w:lang w:val="pt-BR"/>
@@ -3357,11 +5227,19 @@
         </w:rPr>
         <w:t xml:space="preserve">New </w:t>
       </w:r>
-      <w:r>
-        <w:rPr>
-          <w:lang w:val="pt-BR"/>
-        </w:rPr>
-        <w:t>Credential):</w:t>
+      <w:proofErr w:type="spellStart"/>
+      <w:r>
+        <w:rPr>
+          <w:lang w:val="pt-BR"/>
+        </w:rPr>
+        <w:t>Credential</w:t>
+      </w:r>
+      <w:proofErr w:type="spellEnd"/>
+      <w:r>
+        <w:rPr>
+          <w:lang w:val="pt-BR"/>
+        </w:rPr>
+        <w:t>):</w:t>
       </w:r>
     </w:p>
     <w:p>
@@ -3376,34 +5254,54 @@
           <w:lang w:val="pt-BR"/>
         </w:rPr>
       </w:pPr>
+      <w:proofErr w:type="spellStart"/>
       <w:r>
         <w:rPr>
           <w:b/>
           <w:bCs/>
           <w:lang w:val="pt-BR"/>
         </w:rPr>
-        <w:t>Qdrant API:</w:t>
-      </w:r>
-      <w:r>
-        <w:rPr>
-          <w:lang w:val="pt-BR"/>
-        </w:rPr>
-        <w:t xml:space="preserve"> Selecione o tipo </w:t>
-      </w:r>
+        <w:t>Qdrant</w:t>
+      </w:r>
+      <w:proofErr w:type="spellEnd"/>
       <w:r>
         <w:rPr>
           <w:b/>
           <w:bCs/>
           <w:lang w:val="pt-BR"/>
         </w:rPr>
-        <w:t>Qdrant A</w:t>
-      </w:r>
+        <w:t xml:space="preserve"> API:</w:t>
+      </w:r>
+      <w:r>
+        <w:rPr>
+          <w:lang w:val="pt-BR"/>
+        </w:rPr>
+        <w:t xml:space="preserve"> Selecione o tipo </w:t>
+      </w:r>
+      <w:proofErr w:type="spellStart"/>
       <w:r>
         <w:rPr>
           <w:b/>
           <w:bCs/>
           <w:lang w:val="pt-BR"/>
         </w:rPr>
+        <w:t>Qdrant</w:t>
+      </w:r>
+      <w:proofErr w:type="spellEnd"/>
+      <w:r>
+        <w:rPr>
+          <w:b/>
+          <w:bCs/>
+          <w:lang w:val="pt-BR"/>
+        </w:rPr>
+        <w:t xml:space="preserve"> A</w:t>
+      </w:r>
+      <w:r>
+        <w:rPr>
+          <w:b/>
+          <w:bCs/>
+          <w:lang w:val="pt-BR"/>
+        </w:rPr>
         <w:t>PI</w:t>
       </w:r>
       <w:r>
@@ -3422,7 +5320,21 @@
         <w:rPr>
           <w:lang w:val="pt-BR"/>
         </w:rPr>
-        <w:t>de URL com o endpoint obtido e insira a API Key.</w:t>
+        <w:t xml:space="preserve">de URL com o </w:t>
+      </w:r>
+      <w:proofErr w:type="spellStart"/>
+      <w:r>
+        <w:rPr>
+          <w:lang w:val="pt-BR"/>
+        </w:rPr>
+        <w:t>endpoint</w:t>
+      </w:r>
+      <w:proofErr w:type="spellEnd"/>
+      <w:r>
+        <w:rPr>
+          <w:lang w:val="pt-BR"/>
+        </w:rPr>
+        <w:t xml:space="preserve"> obtido e insira a API Key.</w:t>
       </w:r>
     </w:p>
     <w:p>
@@ -3437,52 +5349,108 @@
           <w:lang w:val="pt-BR"/>
         </w:rPr>
       </w:pPr>
+      <w:proofErr w:type="spellStart"/>
       <w:r>
         <w:rPr>
           <w:b/>
           <w:bCs/>
           <w:lang w:val="pt-BR"/>
         </w:rPr>
-        <w:t>Qdrant Header Auth (HTTP Request):</w:t>
-      </w:r>
-      <w:r>
-        <w:rPr>
-          <w:lang w:val="pt-BR"/>
-        </w:rPr>
-        <w:t xml:space="preserve"> Como o fluxo realiza chamadas diretas via</w:t>
-      </w:r>
-      <w:r>
-        <w:rPr>
-          <w:lang w:val="pt-BR"/>
-        </w:rPr>
-        <w:t xml:space="preserve"> </w:t>
-      </w:r>
-      <w:r>
-        <w:rPr>
-          <w:lang w:val="pt-BR"/>
-        </w:rPr>
-        <w:t>requisição HTTP para a API Scroll e para os nós de criação/deleção de coleções, crie uma</w:t>
-      </w:r>
-      <w:r>
-        <w:rPr>
-          <w:lang w:val="pt-BR"/>
-        </w:rPr>
-        <w:t xml:space="preserve"> </w:t>
-      </w:r>
-      <w:r>
-        <w:rPr>
-          <w:lang w:val="pt-BR"/>
-        </w:rPr>
-        <w:t xml:space="preserve">credencial do tipo </w:t>
-      </w:r>
+        <w:t>Qdrant</w:t>
+      </w:r>
+      <w:proofErr w:type="spellEnd"/>
       <w:r>
         <w:rPr>
           <w:b/>
           <w:bCs/>
           <w:lang w:val="pt-BR"/>
         </w:rPr>
-        <w:t>Header Auth</w:t>
-      </w:r>
+        <w:t xml:space="preserve"> Header </w:t>
+      </w:r>
+      <w:proofErr w:type="spellStart"/>
+      <w:r>
+        <w:rPr>
+          <w:b/>
+          <w:bCs/>
+          <w:lang w:val="pt-BR"/>
+        </w:rPr>
+        <w:t>Auth</w:t>
+      </w:r>
+      <w:proofErr w:type="spellEnd"/>
+      <w:r>
+        <w:rPr>
+          <w:b/>
+          <w:bCs/>
+          <w:lang w:val="pt-BR"/>
+        </w:rPr>
+        <w:t xml:space="preserve"> (HTTP </w:t>
+      </w:r>
+      <w:proofErr w:type="spellStart"/>
+      <w:r>
+        <w:rPr>
+          <w:b/>
+          <w:bCs/>
+          <w:lang w:val="pt-BR"/>
+        </w:rPr>
+        <w:t>Request</w:t>
+      </w:r>
+      <w:proofErr w:type="spellEnd"/>
+      <w:r>
+        <w:rPr>
+          <w:b/>
+          <w:bCs/>
+          <w:lang w:val="pt-BR"/>
+        </w:rPr>
+        <w:t>):</w:t>
+      </w:r>
+      <w:r>
+        <w:rPr>
+          <w:lang w:val="pt-BR"/>
+        </w:rPr>
+        <w:t xml:space="preserve"> Como o fluxo realiza chamadas diretas via</w:t>
+      </w:r>
+      <w:r>
+        <w:rPr>
+          <w:lang w:val="pt-BR"/>
+        </w:rPr>
+        <w:t xml:space="preserve"> </w:t>
+      </w:r>
+      <w:r>
+        <w:rPr>
+          <w:lang w:val="pt-BR"/>
+        </w:rPr>
+        <w:t>requisição HTTP para a API Scroll e para os nós de criação/deleção de coleções, crie uma</w:t>
+      </w:r>
+      <w:r>
+        <w:rPr>
+          <w:lang w:val="pt-BR"/>
+        </w:rPr>
+        <w:t xml:space="preserve"> </w:t>
+      </w:r>
+      <w:r>
+        <w:rPr>
+          <w:lang w:val="pt-BR"/>
+        </w:rPr>
+        <w:t xml:space="preserve">credencial do tipo </w:t>
+      </w:r>
+      <w:r>
+        <w:rPr>
+          <w:b/>
+          <w:bCs/>
+          <w:lang w:val="pt-BR"/>
+        </w:rPr>
+        <w:t xml:space="preserve">Header </w:t>
+      </w:r>
+      <w:proofErr w:type="spellStart"/>
+      <w:r>
+        <w:rPr>
+          <w:b/>
+          <w:bCs/>
+          <w:lang w:val="pt-BR"/>
+        </w:rPr>
+        <w:t>Auth</w:t>
+      </w:r>
+      <w:proofErr w:type="spellEnd"/>
       <w:r>
         <w:rPr>
           <w:lang w:val="pt-BR"/>
@@ -3499,8 +5467,16 @@
         <w:rPr>
           <w:lang w:val="pt-BR"/>
         </w:rPr>
-        <w:t>api-key</w:t>
-      </w:r>
+        <w:t>api-</w:t>
+      </w:r>
+      <w:proofErr w:type="spellStart"/>
+      <w:r>
+        <w:rPr>
+          <w:lang w:val="pt-BR"/>
+        </w:rPr>
+        <w:t>key</w:t>
+      </w:r>
+      <w:proofErr w:type="spellEnd"/>
       <w:r>
         <w:rPr>
           <w:lang w:val="pt-BR"/>
@@ -3523,7 +5499,21 @@
         <w:rPr>
           <w:lang w:val="pt-BR"/>
         </w:rPr>
-        <w:t>API Key da conta Qdrant como valor.</w:t>
+        <w:t xml:space="preserve">API Key da conta </w:t>
+      </w:r>
+      <w:proofErr w:type="spellStart"/>
+      <w:r>
+        <w:rPr>
+          <w:lang w:val="pt-BR"/>
+        </w:rPr>
+        <w:t>Qdrant</w:t>
+      </w:r>
+      <w:proofErr w:type="spellEnd"/>
+      <w:r>
+        <w:rPr>
+          <w:lang w:val="pt-BR"/>
+        </w:rPr>
+        <w:t xml:space="preserve"> como valor.</w:t>
       </w:r>
     </w:p>
     <w:p>
@@ -3538,19 +5528,43 @@
           <w:lang w:val="pt-BR"/>
         </w:rPr>
       </w:pPr>
+      <w:proofErr w:type="spellStart"/>
       <w:r>
         <w:rPr>
           <w:b/>
           <w:bCs/>
           <w:lang w:val="pt-BR"/>
         </w:rPr>
-        <w:t>Hugging Face API:</w:t>
-      </w:r>
-      <w:r>
-        <w:rPr>
-          <w:lang w:val="pt-BR"/>
-        </w:rPr>
-        <w:t xml:space="preserve"> Selecione a credencial do Hugging Face e insira o Access Token</w:t>
+        <w:t>Hugging</w:t>
+      </w:r>
+      <w:proofErr w:type="spellEnd"/>
+      <w:r>
+        <w:rPr>
+          <w:b/>
+          <w:bCs/>
+          <w:lang w:val="pt-BR"/>
+        </w:rPr>
+        <w:t xml:space="preserve"> Face API:</w:t>
+      </w:r>
+      <w:r>
+        <w:rPr>
+          <w:lang w:val="pt-BR"/>
+        </w:rPr>
+        <w:t xml:space="preserve"> Selecione a credencial do </w:t>
+      </w:r>
+      <w:proofErr w:type="spellStart"/>
+      <w:r>
+        <w:rPr>
+          <w:lang w:val="pt-BR"/>
+        </w:rPr>
+        <w:t>Hugging</w:t>
+      </w:r>
+      <w:proofErr w:type="spellEnd"/>
+      <w:r>
+        <w:rPr>
+          <w:lang w:val="pt-BR"/>
+        </w:rPr>
+        <w:t xml:space="preserve"> Face e insira o Access Token</w:t>
       </w:r>
       <w:r>
         <w:rPr>
@@ -3577,19 +5591,43 @@
           <w:lang w:val="pt-BR"/>
         </w:rPr>
       </w:pPr>
+      <w:proofErr w:type="spellStart"/>
       <w:r>
         <w:rPr>
           <w:b/>
           <w:bCs/>
           <w:lang w:val="pt-BR"/>
         </w:rPr>
-        <w:t>OpenRouter API:</w:t>
-      </w:r>
-      <w:r>
-        <w:rPr>
-          <w:lang w:val="pt-BR"/>
-        </w:rPr>
-        <w:t xml:space="preserve"> Selecione o tipo correspondente à API do OpenRouter e vincule o seu</w:t>
+        <w:t>OpenRouter</w:t>
+      </w:r>
+      <w:proofErr w:type="spellEnd"/>
+      <w:r>
+        <w:rPr>
+          <w:b/>
+          <w:bCs/>
+          <w:lang w:val="pt-BR"/>
+        </w:rPr>
+        <w:t xml:space="preserve"> API:</w:t>
+      </w:r>
+      <w:r>
+        <w:rPr>
+          <w:lang w:val="pt-BR"/>
+        </w:rPr>
+        <w:t xml:space="preserve"> Selecione o tipo correspondente à API do </w:t>
+      </w:r>
+      <w:proofErr w:type="spellStart"/>
+      <w:r>
+        <w:rPr>
+          <w:lang w:val="pt-BR"/>
+        </w:rPr>
+        <w:t>OpenRouter</w:t>
+      </w:r>
+      <w:proofErr w:type="spellEnd"/>
+      <w:r>
+        <w:rPr>
+          <w:lang w:val="pt-BR"/>
+        </w:rPr>
+        <w:t xml:space="preserve"> e vincule o seu</w:t>
       </w:r>
       <w:r>
         <w:rPr>
@@ -3660,33 +5698,29 @@
           <w:bCs/>
           <w:lang w:val="pt-BR"/>
         </w:rPr>
-        <w:t xml:space="preserve"> Chunking</w:t>
-      </w:r>
-      <w:r>
-        <w:rPr>
-          <w:lang w:val="pt-BR"/>
-        </w:rPr>
-        <w:t xml:space="preserve"> e clique em</w:t>
-      </w:r>
-      <w:r>
-        <w:rPr>
-          <w:lang w:val="pt-BR"/>
-        </w:rPr>
         <w:t xml:space="preserve"> </w:t>
       </w:r>
+      <w:proofErr w:type="spellStart"/>
       <w:r>
         <w:rPr>
           <w:b/>
           <w:bCs/>
           <w:lang w:val="pt-BR"/>
         </w:rPr>
-        <w:t>Execute workflow</w:t>
-      </w:r>
-      <w:r>
-        <w:rPr>
-          <w:lang w:val="pt-BR"/>
-        </w:rPr>
-        <w:t xml:space="preserve">. O nó </w:t>
+        <w:t>Chunking</w:t>
+      </w:r>
+      <w:proofErr w:type="spellEnd"/>
+      <w:r>
+        <w:rPr>
+          <w:lang w:val="pt-BR"/>
+        </w:rPr>
+        <w:t xml:space="preserve"> e clique em</w:t>
+      </w:r>
+      <w:r>
+        <w:rPr>
+          <w:lang w:val="pt-BR"/>
+        </w:rPr>
+        <w:t xml:space="preserve"> </w:t>
       </w:r>
       <w:r>
         <w:rPr>
@@ -3694,38 +5728,62 @@
           <w:bCs/>
           <w:lang w:val="pt-BR"/>
         </w:rPr>
-        <w:t>Form enviar CSV</w:t>
-      </w:r>
-      <w:r>
-        <w:rPr>
-          <w:lang w:val="pt-BR"/>
-        </w:rPr>
-        <w:t xml:space="preserve"> </w:t>
-      </w:r>
-      <w:r>
-        <w:rPr>
-          <w:lang w:val="pt-BR"/>
-        </w:rPr>
-        <w:t>abrirá um</w:t>
-      </w:r>
-      <w:r>
-        <w:rPr>
-          <w:lang w:val="pt-BR"/>
-        </w:rPr>
-        <w:t xml:space="preserve"> </w:t>
-      </w:r>
-      <w:r>
-        <w:rPr>
-          <w:lang w:val="pt-BR"/>
-        </w:rPr>
-        <w:t xml:space="preserve">formulário interno de upload. Selecione o arquivo </w:t>
-      </w:r>
+        <w:t>Execute workflow</w:t>
+      </w:r>
+      <w:r>
+        <w:rPr>
+          <w:lang w:val="pt-BR"/>
+        </w:rPr>
+        <w:t xml:space="preserve">. O nó </w:t>
+      </w:r>
+      <w:proofErr w:type="spellStart"/>
       <w:r>
         <w:rPr>
           <w:b/>
           <w:bCs/>
           <w:lang w:val="pt-BR"/>
         </w:rPr>
+        <w:t>Form</w:t>
+      </w:r>
+      <w:proofErr w:type="spellEnd"/>
+      <w:r>
+        <w:rPr>
+          <w:b/>
+          <w:bCs/>
+          <w:lang w:val="pt-BR"/>
+        </w:rPr>
+        <w:t xml:space="preserve"> enviar CSV</w:t>
+      </w:r>
+      <w:r>
+        <w:rPr>
+          <w:lang w:val="pt-BR"/>
+        </w:rPr>
+        <w:t xml:space="preserve"> </w:t>
+      </w:r>
+      <w:r>
+        <w:rPr>
+          <w:lang w:val="pt-BR"/>
+        </w:rPr>
+        <w:t>abrirá um</w:t>
+      </w:r>
+      <w:r>
+        <w:rPr>
+          <w:lang w:val="pt-BR"/>
+        </w:rPr>
+        <w:t xml:space="preserve"> </w:t>
+      </w:r>
+      <w:r>
+        <w:rPr>
+          <w:lang w:val="pt-BR"/>
+        </w:rPr>
+        <w:t xml:space="preserve">formulário interno de upload. Selecione o arquivo </w:t>
+      </w:r>
+      <w:r>
+        <w:rPr>
+          <w:b/>
+          <w:bCs/>
+          <w:lang w:val="pt-BR"/>
+        </w:rPr>
         <w:t>Catalogo-Produtos.csv</w:t>
       </w:r>
       <w:r>
@@ -3752,11 +5810,19 @@
         </w:rPr>
         <w:t xml:space="preserve"> </w:t>
       </w:r>
-      <w:r>
-        <w:rPr>
-          <w:lang w:val="pt-BR"/>
-        </w:rPr>
-        <w:t>Qdrant e populará os vetores de nomes e princípios ativos com os metadados fiscais</w:t>
+      <w:proofErr w:type="spellStart"/>
+      <w:r>
+        <w:rPr>
+          <w:lang w:val="pt-BR"/>
+        </w:rPr>
+        <w:t>Qdrant</w:t>
+      </w:r>
+      <w:proofErr w:type="spellEnd"/>
+      <w:r>
+        <w:rPr>
+          <w:lang w:val="pt-BR"/>
+        </w:rPr>
+        <w:t xml:space="preserve"> e populará os vetores de nomes e princípios ativos com os metadados fiscais</w:t>
       </w:r>
       <w:r>
         <w:rPr>
@@ -3788,7 +5854,22 @@
         <w:rPr>
           <w:lang w:val="pt-BR"/>
         </w:rPr>
-        <w:t xml:space="preserve">Nota: caso queira mudar o modelo usado para embeddings, altere o nó </w:t>
+        <w:lastRenderedPageBreak/>
+        <w:t xml:space="preserve">Nota: caso queira mudar o modelo usado para </w:t>
+      </w:r>
+      <w:proofErr w:type="spellStart"/>
+      <w:r>
+        <w:rPr>
+          <w:lang w:val="pt-BR"/>
+        </w:rPr>
+        <w:t>embeddings</w:t>
+      </w:r>
+      <w:proofErr w:type="spellEnd"/>
+      <w:r>
+        <w:rPr>
+          <w:lang w:val="pt-BR"/>
+        </w:rPr>
+        <w:t xml:space="preserve">, altere o nó </w:t>
       </w:r>
       <w:r>
         <w:rPr>
@@ -3796,8 +5877,36 @@
           <w:bCs/>
           <w:lang w:val="pt-BR"/>
         </w:rPr>
-        <w:t>Criar Colecao Qdrant</w:t>
-      </w:r>
+        <w:t xml:space="preserve">Criar </w:t>
+      </w:r>
+      <w:proofErr w:type="spellStart"/>
+      <w:r>
+        <w:rPr>
+          <w:b/>
+          <w:bCs/>
+          <w:lang w:val="pt-BR"/>
+        </w:rPr>
+        <w:t>Colecao</w:t>
+      </w:r>
+      <w:proofErr w:type="spellEnd"/>
+      <w:r>
+        <w:rPr>
+          <w:b/>
+          <w:bCs/>
+          <w:lang w:val="pt-BR"/>
+        </w:rPr>
+        <w:t xml:space="preserve"> </w:t>
+      </w:r>
+      <w:proofErr w:type="spellStart"/>
+      <w:r>
+        <w:rPr>
+          <w:b/>
+          <w:bCs/>
+          <w:lang w:val="pt-BR"/>
+        </w:rPr>
+        <w:t>Qdrant</w:t>
+      </w:r>
+      <w:proofErr w:type="spellEnd"/>
       <w:r>
         <w:rPr>
           <w:lang w:val="pt-BR"/>
@@ -3808,7 +5917,21 @@
         <w:rPr>
           <w:lang w:val="pt-BR"/>
         </w:rPr>
-        <w:t>colocando no campo “size” do JSON o tamanho de vetor do novo modelo que será usado.</w:t>
+        <w:t>colocando no campo “</w:t>
+      </w:r>
+      <w:proofErr w:type="spellStart"/>
+      <w:r>
+        <w:rPr>
+          <w:lang w:val="pt-BR"/>
+        </w:rPr>
+        <w:t>size</w:t>
+      </w:r>
+      <w:proofErr w:type="spellEnd"/>
+      <w:r>
+        <w:rPr>
+          <w:lang w:val="pt-BR"/>
+        </w:rPr>
+        <w:t>” do JSON o tamanho de vetor do novo modelo que será usado.</w:t>
       </w:r>
     </w:p>
     <w:p>
@@ -3829,7 +5952,6 @@
           <w:sz w:val="26"/>
           <w:lang w:val="pt-BR"/>
         </w:rPr>
-        <w:lastRenderedPageBreak/>
         <w:t>9.5. Ativação da API de Produção para os Testes</w:t>
       </w:r>
     </w:p>
@@ -3871,6 +5993,7 @@
         </w:rPr>
         <w:t xml:space="preserve"> clique em </w:t>
       </w:r>
+      <w:proofErr w:type="spellStart"/>
       <w:r>
         <w:rPr>
           <w:b/>
@@ -3879,6 +6002,7 @@
         </w:rPr>
         <w:t>Publish</w:t>
       </w:r>
+      <w:proofErr w:type="spellEnd"/>
       <w:r>
         <w:rPr>
           <w:lang w:val="pt-BR"/>
@@ -3901,6 +6025,7 @@
         </w:rPr>
         <w:t xml:space="preserve"> </w:t>
       </w:r>
+      <w:proofErr w:type="spellStart"/>
       <w:r>
         <w:rPr>
           <w:b/>
@@ -3909,19 +6034,44 @@
         </w:rPr>
         <w:t>Solicitacao</w:t>
       </w:r>
-      <w:r>
-        <w:rPr>
-          <w:lang w:val="pt-BR"/>
-        </w:rPr>
-        <w:t xml:space="preserve"> (Webhook) e copie a URL contida na aba </w:t>
-      </w:r>
+      <w:proofErr w:type="spellEnd"/>
+      <w:r>
+        <w:rPr>
+          <w:lang w:val="pt-BR"/>
+        </w:rPr>
+        <w:t xml:space="preserve"> (</w:t>
+      </w:r>
+      <w:proofErr w:type="spellStart"/>
+      <w:r>
+        <w:rPr>
+          <w:lang w:val="pt-BR"/>
+        </w:rPr>
+        <w:t>Webhook</w:t>
+      </w:r>
+      <w:proofErr w:type="spellEnd"/>
+      <w:r>
+        <w:rPr>
+          <w:lang w:val="pt-BR"/>
+        </w:rPr>
+        <w:t xml:space="preserve">) e copie a URL contida na aba </w:t>
+      </w:r>
+      <w:proofErr w:type="spellStart"/>
       <w:r>
         <w:rPr>
           <w:b/>
           <w:bCs/>
           <w:lang w:val="pt-BR"/>
         </w:rPr>
-        <w:t>Production URL</w:t>
+        <w:t>Production</w:t>
+      </w:r>
+      <w:proofErr w:type="spellEnd"/>
+      <w:r>
+        <w:rPr>
+          <w:b/>
+          <w:bCs/>
+          <w:lang w:val="pt-BR"/>
+        </w:rPr>
+        <w:t xml:space="preserve"> URL</w:t>
       </w:r>
       <w:r>
         <w:rPr>
@@ -3948,14 +6098,70 @@
         </w:rPr>
         <w:t xml:space="preserve">Baixe as dependências do arquivo de testes Python usando o comando </w:t>
       </w:r>
+      <w:proofErr w:type="spellStart"/>
       <w:r>
         <w:rPr>
           <w:b/>
           <w:bCs/>
           <w:lang w:val="pt-BR"/>
         </w:rPr>
-        <w:t>pip install streamlit requests</w:t>
-      </w:r>
+        <w:t>pip</w:t>
+      </w:r>
+      <w:proofErr w:type="spellEnd"/>
+      <w:r>
+        <w:rPr>
+          <w:b/>
+          <w:bCs/>
+          <w:lang w:val="pt-BR"/>
+        </w:rPr>
+        <w:t xml:space="preserve"> </w:t>
+      </w:r>
+      <w:proofErr w:type="spellStart"/>
+      <w:r>
+        <w:rPr>
+          <w:b/>
+          <w:bCs/>
+          <w:lang w:val="pt-BR"/>
+        </w:rPr>
+        <w:t>install</w:t>
+      </w:r>
+      <w:proofErr w:type="spellEnd"/>
+      <w:r>
+        <w:rPr>
+          <w:b/>
+          <w:bCs/>
+          <w:lang w:val="pt-BR"/>
+        </w:rPr>
+        <w:t xml:space="preserve"> </w:t>
+      </w:r>
+      <w:proofErr w:type="spellStart"/>
+      <w:r>
+        <w:rPr>
+          <w:b/>
+          <w:bCs/>
+          <w:lang w:val="pt-BR"/>
+        </w:rPr>
+        <w:t>streamlit</w:t>
+      </w:r>
+      <w:proofErr w:type="spellEnd"/>
+      <w:r>
+        <w:rPr>
+          <w:b/>
+          <w:bCs/>
+          <w:lang w:val="pt-BR"/>
+        </w:rPr>
+        <w:t xml:space="preserve"> </w:t>
+      </w:r>
+      <w:proofErr w:type="spellStart"/>
+      <w:r>
+        <w:rPr>
+          <w:b/>
+          <w:bCs/>
+          <w:lang w:val="pt-BR"/>
+        </w:rPr>
+        <w:t>requests</w:t>
+      </w:r>
+      <w:proofErr w:type="spellEnd"/>
       <w:r>
         <w:rPr>
           <w:lang w:val="pt-BR"/>
@@ -3995,13 +6201,41 @@
         </w:rPr>
         <w:t xml:space="preserve">usando o comando </w:t>
       </w:r>
+      <w:proofErr w:type="spellStart"/>
       <w:r>
         <w:rPr>
           <w:b/>
           <w:bCs/>
           <w:lang w:val="pt-BR"/>
         </w:rPr>
-        <w:t>streamlit run testar_n8n.py</w:t>
+        <w:t>streamlit</w:t>
+      </w:r>
+      <w:proofErr w:type="spellEnd"/>
+      <w:r>
+        <w:rPr>
+          <w:b/>
+          <w:bCs/>
+          <w:lang w:val="pt-BR"/>
+        </w:rPr>
+        <w:t xml:space="preserve"> </w:t>
+      </w:r>
+      <w:proofErr w:type="spellStart"/>
+      <w:r>
+        <w:rPr>
+          <w:b/>
+          <w:bCs/>
+          <w:lang w:val="pt-BR"/>
+        </w:rPr>
+        <w:t>run</w:t>
+      </w:r>
+      <w:proofErr w:type="spellEnd"/>
+      <w:r>
+        <w:rPr>
+          <w:b/>
+          <w:bCs/>
+          <w:lang w:val="pt-BR"/>
+        </w:rPr>
+        <w:t xml:space="preserve"> testar_n8n.py</w:t>
       </w:r>
       <w:r>
         <w:rPr>
@@ -4068,7 +6302,35 @@
         <w:rPr>
           <w:lang w:val="pt-BR"/>
         </w:rPr>
-        <w:t>barra lateral do frontend em Streamlit e execute a bateria de testes automatizados para validar</w:t>
+        <w:t xml:space="preserve">barra lateral do </w:t>
+      </w:r>
+      <w:proofErr w:type="spellStart"/>
+      <w:r>
+        <w:rPr>
+          <w:lang w:val="pt-BR"/>
+        </w:rPr>
+        <w:t>frontend</w:t>
+      </w:r>
+      <w:proofErr w:type="spellEnd"/>
+      <w:r>
+        <w:rPr>
+          <w:lang w:val="pt-BR"/>
+        </w:rPr>
+        <w:t xml:space="preserve"> em </w:t>
+      </w:r>
+      <w:proofErr w:type="spellStart"/>
+      <w:r>
+        <w:rPr>
+          <w:lang w:val="pt-BR"/>
+        </w:rPr>
+        <w:t>Streamlit</w:t>
+      </w:r>
+      <w:proofErr w:type="spellEnd"/>
+      <w:r>
+        <w:rPr>
+          <w:lang w:val="pt-BR"/>
+        </w:rPr>
+        <w:t xml:space="preserve"> e execute a bateria de testes automatizados para validar</w:t>
       </w:r>
       <w:r>
         <w:rPr>

</xml_diff>